<commit_message>
vault backup: 2026-01-19 09:22:19
</commit_message>
<xml_diff>
--- a/BWL/Übung/Prüfung_Übung/Prüfung_Hilfszettel.docx
+++ b/BWL/Übung/Prüfung_Übung/Prüfung_Hilfszettel.docx
@@ -11,13 +11,22 @@
           <w:highlight w:val="none"/>
         </w:rPr>
       </w:pPr>
+      <w:r/>
       <w:r>
         <mc:AlternateContent>
           <mc:Choice Requires="wpg">
             <w:drawing>
-              <wp:inline xmlns:wp="http://schemas.openxmlformats.org/drawingml/2006/wordprocessingDrawing" distT="0" distB="0" distL="0" distR="0">
-                <wp:extent cx="7110000" cy="1218200"/>
+              <wp:anchor xmlns:wp="http://schemas.openxmlformats.org/drawingml/2006/wordprocessingDrawing" xmlns:wp14="http://schemas.microsoft.com/office/word/2010/wordprocessingDrawing" distT="0" distB="0" distL="115200" distR="115200" simplePos="0" relativeHeight="9216" behindDoc="0" locked="0" layoutInCell="1" allowOverlap="1">
+                <wp:simplePos x="0" y="0"/>
+                <wp:positionH relativeFrom="column">
+                  <wp:posOffset>-57150</wp:posOffset>
+                </wp:positionH>
+                <wp:positionV relativeFrom="paragraph">
+                  <wp:posOffset>1459732</wp:posOffset>
+                </wp:positionV>
+                <wp:extent cx="5545160" cy="1345490"/>
                 <wp:effectExtent l="0" t="0" r="0" b="0"/>
+                <wp:wrapNone/>
                 <wp:docPr id="1" name=""/>
                 <wp:cNvGraphicFramePr>
                   <a:graphicFrameLocks xmlns:a="http://schemas.openxmlformats.org/drawingml/2006/main" noChangeAspect="1"/>
@@ -26,7 +35,7 @@
                   <a:graphicData uri="http://schemas.openxmlformats.org/drawingml/2006/picture">
                     <pic:pic xmlns:pic="http://schemas.openxmlformats.org/drawingml/2006/picture">
                       <pic:nvPicPr>
-                        <pic:cNvPr id="2041568295" name=""/>
+                        <pic:cNvPr id="1182242857" name=""/>
                         <pic:cNvPicPr>
                           <a:picLocks noChangeAspect="1"/>
                         </pic:cNvPicPr>
@@ -37,9 +46,79 @@
                         <a:stretch/>
                       </pic:blipFill>
                       <pic:spPr bwMode="auto">
+                        <a:xfrm flipH="0" flipV="0">
+                          <a:off x="0" y="0"/>
+                          <a:ext cx="5545159" cy="1345489"/>
+                        </a:xfrm>
+                        <a:prstGeom prst="rect">
+                          <a:avLst/>
+                        </a:prstGeom>
+                      </pic:spPr>
+                    </pic:pic>
+                  </a:graphicData>
+                </a:graphic>
+              </wp:anchor>
+            </w:drawing>
+          </mc:Choice>
+          <mc:Fallback>
+            <w:pict>
+              <v:shapetype id="_x0000_t75" coordsize="21600,21600" o:spt="75" o:preferrelative="t" path="m@4@5l@4@11@9@11@9@5xe" filled="f" stroked="f">
+                <v:stroke joinstyle="miter"/>
+                <v:formulas>
+                  <v:f eqn="if lineDrawn pixelLineWidth 0"/>
+                  <v:f eqn="sum @0 1 0"/>
+                  <v:f eqn="sum 0 0 @1"/>
+                  <v:f eqn="prod @2 1 2"/>
+                  <v:f eqn="prod @3 21600 pixelWidth"/>
+                  <v:f eqn="prod @3 21600 pixelHeight"/>
+                  <v:f eqn="sum @0 0 1"/>
+                  <v:f eqn="prod @6 1 2"/>
+                  <v:f eqn="prod @7 21600 pixelWidth"/>
+                  <v:f eqn="sum @8 21600 0"/>
+                  <v:f eqn="prod @7 21600 pixelHeight"/>
+                  <v:f eqn="sum @10 21600 0"/>
+                </v:formulas>
+                <v:path o:extrusionok="f" gradientshapeok="t" o:connecttype="rect"/>
+                <o:lock v:ext="edit" aspectratio="t"/>
+              </v:shapetype>
+              <v:shape id="_x0000_i0" o:spid="_x0000_s0" type="#_x0000_t75" style="position:absolute;z-index:9216;o:allowoverlap:true;o:allowincell:true;mso-position-horizontal-relative:text;margin-left:-4.50pt;mso-position-horizontal:absolute;mso-position-vertical-relative:text;margin-top:114.94pt;mso-position-vertical:absolute;width:436.63pt;height:105.94pt;mso-wrap-distance-left:9.07pt;mso-wrap-distance-top:0.00pt;mso-wrap-distance-right:9.07pt;mso-wrap-distance-bottom:0.00pt;z-index:1;" stroked="false">
+                <v:imagedata r:id="rId8" o:title=""/>
+                <o:lock v:ext="edit" rotation="t"/>
+              </v:shape>
+            </w:pict>
+          </mc:Fallback>
+        </mc:AlternateContent>
+      </w:r>
+      <w:r/>
+      <w:r>
+        <mc:AlternateContent>
+          <mc:Choice Requires="wpg">
+            <w:drawing>
+              <wp:inline xmlns:wp="http://schemas.openxmlformats.org/drawingml/2006/wordprocessingDrawing" distT="0" distB="0" distL="0" distR="0">
+                <wp:extent cx="7110000" cy="1218200"/>
+                <wp:effectExtent l="0" t="0" r="0" b="0"/>
+                <wp:docPr id="2" name=""/>
+                <wp:cNvGraphicFramePr>
+                  <a:graphicFrameLocks xmlns:a="http://schemas.openxmlformats.org/drawingml/2006/main" noChangeAspect="1"/>
+                </wp:cNvGraphicFramePr>
+                <a:graphic xmlns:a="http://schemas.openxmlformats.org/drawingml/2006/main">
+                  <a:graphicData uri="http://schemas.openxmlformats.org/drawingml/2006/picture">
+                    <pic:pic xmlns:pic="http://schemas.openxmlformats.org/drawingml/2006/picture">
+                      <pic:nvPicPr>
+                        <pic:cNvPr id="278198535" name=""/>
+                        <pic:cNvPicPr>
+                          <a:picLocks noChangeAspect="1"/>
+                        </pic:cNvPicPr>
+                        <pic:nvPr/>
+                      </pic:nvPicPr>
+                      <pic:blipFill rotWithShape="1">
+                        <a:blip r:embed="rId9"/>
+                        <a:stretch/>
+                      </pic:blipFill>
+                      <pic:spPr bwMode="auto">
                         <a:xfrm>
                           <a:off x="0" y="0"/>
-                          <a:ext cx="7110000" cy="1218200"/>
+                          <a:ext cx="7110000" cy="1218199"/>
                         </a:xfrm>
                         <a:prstGeom prst="rect">
                           <a:avLst/>
@@ -72,8 +151,414 @@
                 <v:path o:extrusionok="f" gradientshapeok="t" o:connecttype="rect"/>
                 <o:lock v:ext="edit" aspectratio="t"/>
               </v:shapetype>
-              <v:shape id="_x0000_i0" o:spid="_x0000_s0" type="#_x0000_t75" style="width:559.84pt;height:95.92pt;mso-wrap-distance-left:0.00pt;mso-wrap-distance-top:0.00pt;mso-wrap-distance-right:0.00pt;mso-wrap-distance-bottom:0.00pt;z-index:1;" stroked="false">
-                <v:imagedata r:id="rId8" o:title=""/>
+              <v:shape id="_x0000_i1" o:spid="_x0000_s1" type="#_x0000_t75" style="width:559.84pt;height:95.92pt;mso-wrap-distance-left:0.00pt;mso-wrap-distance-top:0.00pt;mso-wrap-distance-right:0.00pt;mso-wrap-distance-bottom:0.00pt;z-index:1;" stroked="false">
+                <v:imagedata r:id="rId9" o:title=""/>
+                <o:lock v:ext="edit" rotation="t"/>
+              </v:shape>
+            </w:pict>
+          </mc:Fallback>
+        </mc:AlternateContent>
+      </w:r>
+      <w:r/>
+      <w:r>
+        <w:rPr>
+          <w:lang w:val="de-AT"/>
+        </w:rPr>
+      </w:r>
+      <w:r>
+        <w:rPr>
+          <w:highlight w:val="none"/>
+        </w:rPr>
+      </w:r>
+      <w:r>
+        <w:rPr>
+          <w:highlight w:val="none"/>
+          <w:lang w:val="de-AT"/>
+        </w:rPr>
+      </w:r>
+      <w:r>
+        <w:rPr>
+          <w:highlight w:val="none"/>
+          <w:lang w:val="de-AT"/>
+        </w:rPr>
+        <w:t xml:space="preserve">Anlagendeckung Grad I ist ohne langfr. Eigenkapital</w:t>
+      </w:r>
+      <w:r>
+        <w:rPr>
+          <w:highlight w:val="none"/>
+          <w:lang w:val="de-AT"/>
+        </w:rPr>
+      </w:r>
+      <w:r>
+        <w:rPr>
+          <w:highlight w:val="none"/>
+          <w:lang w:val="de-AT"/>
+        </w:rPr>
+      </w:r>
+      <w:r>
+        <w:rPr>
+          <w:highlight w:val="none"/>
+        </w:rPr>
+      </w:r>
+    </w:p>
+    <w:p>
+      <w:pPr>
+        <w:pBdr/>
+        <w:tabs>
+          <w:tab w:val="left" w:leader="none" w:pos="1488"/>
+        </w:tabs>
+        <w:spacing/>
+        <w:ind/>
+        <w:rPr>
+          <w:highlight w:val="none"/>
+          <w:lang w:val="de-AT"/>
+        </w:rPr>
+      </w:pPr>
+      <w:r>
+        <w:rPr>
+          <w:highlight w:val="none"/>
+          <w:lang w:val="de-AT"/>
+        </w:rPr>
+      </w:r>
+      <w:r/>
+      <w:r>
+        <w:rPr>
+          <w:highlight w:val="none"/>
+          <w:lang w:val="de-AT"/>
+        </w:rPr>
+      </w:r>
+      <w:r/>
+      <w:r>
+        <w:rPr>
+          <w:highlight w:val="none"/>
+          <w:lang w:val="de-AT"/>
+        </w:rPr>
+      </w:r>
+      <w:r>
+        <w:rPr>
+          <w:highlight w:val="none"/>
+          <w:lang w:val="de-AT"/>
+        </w:rPr>
+      </w:r>
+      <w:r>
+        <w:rPr>
+          <w:highlight w:val="none"/>
+          <w:lang w:val="de-AT"/>
+        </w:rPr>
+      </w:r>
+    </w:p>
+    <w:p>
+      <w:pPr>
+        <w:pBdr/>
+        <w:tabs>
+          <w:tab w:val="left" w:leader="none" w:pos="1488"/>
+        </w:tabs>
+        <w:spacing/>
+        <w:ind/>
+        <w:rPr>
+          <w:highlight w:val="none"/>
+          <w:lang w:val="de-AT"/>
+        </w:rPr>
+      </w:pPr>
+      <w:r>
+        <w:rPr>
+          <w:highlight w:val="none"/>
+          <w:lang w:val="de-AT"/>
+        </w:rPr>
+      </w:r>
+      <w:r/>
+      <w:r>
+        <w:rPr>
+          <w:highlight w:val="none"/>
+          <w:lang w:val="de-AT"/>
+        </w:rPr>
+      </w:r>
+      <w:r>
+        <w:rPr>
+          <w:highlight w:val="none"/>
+          <w:lang w:val="de-AT"/>
+        </w:rPr>
+        <w:tab/>
+      </w:r>
+      <w:r>
+        <w:rPr>
+          <w:highlight w:val="none"/>
+          <w:lang w:val="de-AT"/>
+        </w:rPr>
+      </w:r>
+    </w:p>
+    <w:p>
+      <w:pPr>
+        <w:pBdr/>
+        <w:tabs>
+          <w:tab w:val="left" w:leader="none" w:pos="1488"/>
+        </w:tabs>
+        <w:spacing/>
+        <w:ind/>
+        <w:rPr>
+          <w:highlight w:val="none"/>
+          <w:lang w:val="de-AT"/>
+        </w:rPr>
+      </w:pPr>
+      <w:r>
+        <w:rPr>
+          <w:highlight w:val="none"/>
+          <w:lang w:val="de-AT"/>
+        </w:rPr>
+      </w:r>
+      <w:r>
+        <w:rPr>
+          <w:highlight w:val="none"/>
+          <w:lang w:val="de-AT"/>
+        </w:rPr>
+      </w:r>
+      <w:r>
+        <w:rPr>
+          <w:highlight w:val="none"/>
+          <w:lang w:val="de-AT"/>
+        </w:rPr>
+      </w:r>
+    </w:p>
+    <w:p>
+      <w:pPr>
+        <w:pBdr/>
+        <w:tabs>
+          <w:tab w:val="left" w:leader="none" w:pos="1488"/>
+        </w:tabs>
+        <w:spacing/>
+        <w:ind/>
+        <w:rPr>
+          <w:highlight w:val="none"/>
+          <w:lang w:val="de-AT"/>
+        </w:rPr>
+      </w:pPr>
+      <w:r>
+        <w:rPr>
+          <w:highlight w:val="none"/>
+          <w:lang w:val="de-AT"/>
+        </w:rPr>
+      </w:r>
+      <w:r/>
+      <w:r>
+        <w:rPr>
+          <w:highlight w:val="none"/>
+          <w:lang w:val="de-AT"/>
+        </w:rPr>
+      </w:r>
+      <w:r>
+        <w:rPr>
+          <w:highlight w:val="none"/>
+          <w:lang w:val="de-AT"/>
+        </w:rPr>
+      </w:r>
+      <w:r>
+        <w:rPr>
+          <w:highlight w:val="none"/>
+          <w:lang w:val="de-AT"/>
+        </w:rPr>
+      </w:r>
+    </w:p>
+    <w:p>
+      <w:pPr>
+        <w:pBdr/>
+        <w:tabs>
+          <w:tab w:val="left" w:leader="none" w:pos="1488"/>
+        </w:tabs>
+        <w:spacing/>
+        <w:ind/>
+        <w:rPr>
+          <w:highlight w:val="none"/>
+          <w:lang w:val="de-AT"/>
+        </w:rPr>
+      </w:pPr>
+      <w:r>
+        <w:rPr>
+          <w:highlight w:val="none"/>
+          <w:lang w:val="de-AT"/>
+        </w:rPr>
+      </w:r>
+      <w:r/>
+      <w:r>
+        <w:rPr>
+          <w:highlight w:val="none"/>
+          <w:lang w:val="de-AT"/>
+        </w:rPr>
+      </w:r>
+      <w:r>
+        <w:rPr>
+          <w:highlight w:val="none"/>
+          <w:lang w:val="de-AT"/>
+        </w:rPr>
+      </w:r>
+      <w:r>
+        <w:rPr>
+          <w:highlight w:val="none"/>
+          <w:lang w:val="de-AT"/>
+        </w:rPr>
+      </w:r>
+    </w:p>
+    <w:p>
+      <w:pPr>
+        <w:pBdr/>
+        <w:tabs>
+          <w:tab w:val="left" w:leader="none" w:pos="1488"/>
+        </w:tabs>
+        <w:spacing/>
+        <w:ind/>
+        <w:rPr>
+          <w:highlight w:val="none"/>
+          <w:lang w:val="de-AT"/>
+        </w:rPr>
+      </w:pPr>
+      <w:r>
+        <w:rPr>
+          <w:highlight w:val="none"/>
+          <w:lang w:val="de-AT" w:bidi="de-AT"/>
+        </w:rPr>
+      </w:r>
+      <w:r/>
+      <w:r>
+        <w:rPr>
+          <w:highlight w:val="none"/>
+          <w:lang w:val="de-AT" w:bidi="de-AT"/>
+        </w:rPr>
+      </w:r>
+      <w:r>
+        <w:rPr>
+          <w:highlight w:val="none"/>
+          <w:lang w:val="de-AT"/>
+        </w:rPr>
+      </w:r>
+      <w:r>
+        <w:rPr>
+          <w:highlight w:val="none"/>
+          <w:lang w:val="de-AT"/>
+        </w:rPr>
+      </w:r>
+    </w:p>
+    <w:p>
+      <w:pPr>
+        <w:pBdr/>
+        <w:tabs>
+          <w:tab w:val="left" w:leader="none" w:pos="1488"/>
+        </w:tabs>
+        <w:spacing/>
+        <w:ind/>
+        <w:rPr>
+          <w:highlight w:val="none"/>
+          <w:lang w:val="de-AT"/>
+        </w:rPr>
+      </w:pPr>
+      <w:r>
+        <w:rPr>
+          <w:highlight w:val="none"/>
+          <w:lang w:val="de-AT"/>
+        </w:rPr>
+      </w:r>
+      <w:r/>
+      <w:r>
+        <w:rPr>
+          <w:highlight w:val="none"/>
+          <w:lang w:val="de-AT"/>
+        </w:rPr>
+      </w:r>
+      <w:r>
+        <w:rPr>
+          <w:highlight w:val="none"/>
+          <w:lang w:val="de-AT"/>
+        </w:rPr>
+      </w:r>
+    </w:p>
+    <w:p>
+      <w:pPr>
+        <w:pBdr/>
+        <w:tabs>
+          <w:tab w:val="left" w:leader="none" w:pos="1488"/>
+        </w:tabs>
+        <w:spacing/>
+        <w:ind/>
+        <w:rPr>
+          <w:highlight w:val="none"/>
+          <w:lang w:val="de-AT"/>
+        </w:rPr>
+      </w:pPr>
+      <w:r>
+        <w:rPr>
+          <w:highlight w:val="none"/>
+          <w:lang w:val="de-AT" w:bidi="de-AT"/>
+        </w:rPr>
+      </w:r>
+      <w:r>
+        <mc:AlternateContent>
+          <mc:Choice Requires="wpg">
+            <w:drawing>
+              <wp:anchor xmlns:wp="http://schemas.openxmlformats.org/drawingml/2006/wordprocessingDrawing" xmlns:wp14="http://schemas.microsoft.com/office/word/2010/wordprocessingDrawing" distT="0" distB="0" distL="115200" distR="115200" simplePos="0" relativeHeight="3072" behindDoc="0" locked="0" layoutInCell="1" allowOverlap="1">
+                <wp:simplePos x="0" y="0"/>
+                <wp:positionH relativeFrom="column">
+                  <wp:posOffset>-57150</wp:posOffset>
+                </wp:positionH>
+                <wp:positionV relativeFrom="paragraph">
+                  <wp:posOffset>694006</wp:posOffset>
+                </wp:positionV>
+                <wp:extent cx="4545035" cy="1340167"/>
+                <wp:effectExtent l="0" t="0" r="0" b="0"/>
+                <wp:wrapNone/>
+                <wp:docPr id="3" name=""/>
+                <wp:cNvGraphicFramePr>
+                  <a:graphicFrameLocks xmlns:a="http://schemas.openxmlformats.org/drawingml/2006/main" noChangeAspect="1"/>
+                </wp:cNvGraphicFramePr>
+                <a:graphic xmlns:a="http://schemas.openxmlformats.org/drawingml/2006/main">
+                  <a:graphicData uri="http://schemas.openxmlformats.org/drawingml/2006/picture">
+                    <pic:pic xmlns:pic="http://schemas.openxmlformats.org/drawingml/2006/picture">
+                      <pic:nvPicPr>
+                        <pic:cNvPr id="1686201103" name=""/>
+                        <pic:cNvPicPr>
+                          <a:picLocks noChangeAspect="1"/>
+                        </pic:cNvPicPr>
+                        <pic:nvPr/>
+                      </pic:nvPicPr>
+                      <pic:blipFill rotWithShape="1">
+                        <a:blip r:embed="rId10"/>
+                        <a:stretch/>
+                      </pic:blipFill>
+                      <pic:spPr bwMode="auto">
+                        <a:xfrm flipH="0" flipV="0">
+                          <a:off x="0" y="0"/>
+                          <a:ext cx="4545034" cy="1340166"/>
+                        </a:xfrm>
+                        <a:prstGeom prst="rect">
+                          <a:avLst/>
+                        </a:prstGeom>
+                      </pic:spPr>
+                    </pic:pic>
+                  </a:graphicData>
+                </a:graphic>
+              </wp:anchor>
+            </w:drawing>
+          </mc:Choice>
+          <mc:Fallback>
+            <w:pict>
+              <v:shapetype id="_x0000_t75" coordsize="21600,21600" o:spt="75" o:preferrelative="t" path="m@4@5l@4@11@9@11@9@5xe" filled="f" stroked="f">
+                <v:stroke joinstyle="miter"/>
+                <v:formulas>
+                  <v:f eqn="if lineDrawn pixelLineWidth 0"/>
+                  <v:f eqn="sum @0 1 0"/>
+                  <v:f eqn="sum 0 0 @1"/>
+                  <v:f eqn="prod @2 1 2"/>
+                  <v:f eqn="prod @3 21600 pixelWidth"/>
+                  <v:f eqn="prod @3 21600 pixelHeight"/>
+                  <v:f eqn="sum @0 0 1"/>
+                  <v:f eqn="prod @6 1 2"/>
+                  <v:f eqn="prod @7 21600 pixelWidth"/>
+                  <v:f eqn="sum @8 21600 0"/>
+                  <v:f eqn="prod @7 21600 pixelHeight"/>
+                  <v:f eqn="sum @10 21600 0"/>
+                </v:formulas>
+                <v:path o:extrusionok="f" gradientshapeok="t" o:connecttype="rect"/>
+                <o:lock v:ext="edit" aspectratio="t"/>
+              </v:shapetype>
+              <v:shape id="_x0000_i2" o:spid="_x0000_s2" type="#_x0000_t75" style="position:absolute;z-index:3072;o:allowoverlap:true;o:allowincell:true;mso-position-horizontal-relative:text;margin-left:-4.50pt;mso-position-horizontal:absolute;mso-position-vertical-relative:text;margin-top:54.65pt;mso-position-vertical:absolute;width:357.88pt;height:105.52pt;mso-wrap-distance-left:9.07pt;mso-wrap-distance-top:0.00pt;mso-wrap-distance-right:9.07pt;mso-wrap-distance-bottom:0.00pt;z-index:1;" stroked="false">
+                <v:imagedata r:id="rId10" o:title=""/>
                 <o:lock v:ext="edit" rotation="t"/>
               </v:shape>
             </w:pict>
@@ -82,25 +567,29 @@
       </w:r>
       <w:r>
         <w:rPr>
-          <w:lang w:val="de-AT"/>
+          <w:highlight w:val="none"/>
+          <w:lang w:val="de-AT" w:bidi="de-AT"/>
         </w:rPr>
       </w:r>
       <w:r/>
-    </w:p>
-    <w:p>
-      <w:pPr>
-        <w:pBdr/>
-        <w:tabs>
-          <w:tab w:val="left" w:leader="none" w:pos="1488"/>
-        </w:tabs>
-        <w:spacing/>
-        <w:ind/>
-        <w:rPr/>
-      </w:pPr>
       <w:r>
         <w:rPr>
           <w:highlight w:val="none"/>
-          <w:lang w:val="de-AT"/>
+          <w:lang w:val="de-AT" w:bidi="de-AT"/>
+        </w:rPr>
+      </w:r>
+      <w:r/>
+      <w:r>
+        <w:rPr>
+          <w:highlight w:val="none"/>
+          <w:lang w:val="de-AT" w:bidi="de-AT"/>
+        </w:rPr>
+      </w:r>
+      <w:r/>
+      <w:r>
+        <w:rPr>
+          <w:highlight w:val="none"/>
+          <w:lang w:val="de-AT" w:bidi="de-AT"/>
         </w:rPr>
       </w:r>
       <w:r>
@@ -138,7 +627,6 @@
         <w:ind/>
         <w:rPr/>
       </w:pPr>
-      <w:r/>
       <w:r>
         <w:separator/>
       </w:r>
@@ -153,7 +641,6 @@
         <w:ind/>
         <w:rPr/>
       </w:pPr>
-      <w:r/>
       <w:r>
         <w:continuationSeparator/>
       </w:r>
@@ -173,7 +660,6 @@
         <w:ind/>
         <w:rPr/>
       </w:pPr>
-      <w:r/>
       <w:r>
         <w:separator/>
       </w:r>
@@ -188,7 +674,6 @@
         <w:ind/>
         <w:rPr/>
       </w:pPr>
-      <w:r/>
       <w:r>
         <w:continuationSeparator/>
       </w:r>
@@ -356,9 +841,9 @@
     <w:lsdException w:name="Bibliography" w:uiPriority="37"/>
     <w:lsdException w:name="TOC Heading" w:uiPriority="39" w:qFormat="1"/>
   </w:latentStyles>
-  <w:style w:type="table" w:styleId="12">
+  <w:style w:type="table" w:styleId="701">
     <w:name w:val="Table Grid"/>
-    <w:basedOn w:val="665"/>
+    <w:basedOn w:val="887"/>
     <w:uiPriority w:val="59"/>
     <w:pPr>
       <w:pBdr/>
@@ -555,9 +1040,9 @@
       </w:tcPr>
     </w:tblStylePr>
   </w:style>
-  <w:style w:type="table" w:styleId="13">
+  <w:style w:type="table" w:styleId="702">
     <w:name w:val="Table Grid Light"/>
-    <w:basedOn w:val="665"/>
+    <w:basedOn w:val="887"/>
     <w:uiPriority w:val="59"/>
     <w:pPr>
       <w:pBdr/>
@@ -754,9 +1239,9 @@
       </w:tcPr>
     </w:tblStylePr>
   </w:style>
-  <w:style w:type="table" w:styleId="14">
+  <w:style w:type="table" w:styleId="703">
     <w:name w:val="Plain Table 1"/>
-    <w:basedOn w:val="665"/>
+    <w:basedOn w:val="887"/>
     <w:uiPriority w:val="59"/>
     <w:pPr>
       <w:pBdr/>
@@ -979,9 +1464,9 @@
       </w:tcPr>
     </w:tblStylePr>
   </w:style>
-  <w:style w:type="table" w:styleId="15">
+  <w:style w:type="table" w:styleId="704">
     <w:name w:val="Plain Table 2"/>
-    <w:basedOn w:val="665"/>
+    <w:basedOn w:val="887"/>
     <w:uiPriority w:val="59"/>
     <w:pPr>
       <w:pBdr/>
@@ -1212,9 +1697,9 @@
       </w:tcPr>
     </w:tblStylePr>
   </w:style>
-  <w:style w:type="table" w:styleId="16">
+  <w:style w:type="table" w:styleId="705">
     <w:name w:val="Plain Table 3"/>
-    <w:basedOn w:val="665"/>
+    <w:basedOn w:val="887"/>
     <w:uiPriority w:val="99"/>
     <w:pPr>
       <w:pBdr/>
@@ -1442,9 +1927,9 @@
       </w:tcPr>
     </w:tblStylePr>
   </w:style>
-  <w:style w:type="table" w:styleId="17">
+  <w:style w:type="table" w:styleId="706">
     <w:name w:val="Plain Table 4"/>
-    <w:basedOn w:val="665"/>
+    <w:basedOn w:val="887"/>
     <w:uiPriority w:val="99"/>
     <w:pPr>
       <w:pBdr/>
@@ -1658,9 +2143,9 @@
       </w:tcPr>
     </w:tblStylePr>
   </w:style>
-  <w:style w:type="table" w:styleId="18">
+  <w:style w:type="table" w:styleId="707">
     <w:name w:val="Plain Table 5"/>
-    <w:basedOn w:val="665"/>
+    <w:basedOn w:val="887"/>
     <w:uiPriority w:val="99"/>
     <w:pPr>
       <w:pBdr/>
@@ -1891,9 +2376,9 @@
       </w:tcPr>
     </w:tblStylePr>
   </w:style>
-  <w:style w:type="table" w:styleId="19">
+  <w:style w:type="table" w:styleId="708">
     <w:name w:val="Grid Table 1 Light"/>
-    <w:basedOn w:val="665"/>
+    <w:basedOn w:val="887"/>
     <w:uiPriority w:val="99"/>
     <w:pPr>
       <w:pBdr/>
@@ -2114,9 +2599,9 @@
       </w:tcPr>
     </w:tblStylePr>
   </w:style>
-  <w:style w:type="table" w:styleId="20">
+  <w:style w:type="table" w:styleId="709">
     <w:name w:val="Grid Table 1 Light - Accent 1"/>
-    <w:basedOn w:val="665"/>
+    <w:basedOn w:val="887"/>
     <w:uiPriority w:val="99"/>
     <w:pPr>
       <w:pBdr/>
@@ -2337,9 +2822,9 @@
       </w:tcPr>
     </w:tblStylePr>
   </w:style>
-  <w:style w:type="table" w:styleId="21">
+  <w:style w:type="table" w:styleId="710">
     <w:name w:val="Grid Table 1 Light - Accent 2"/>
-    <w:basedOn w:val="665"/>
+    <w:basedOn w:val="887"/>
     <w:uiPriority w:val="99"/>
     <w:pPr>
       <w:pBdr/>
@@ -2560,9 +3045,9 @@
       </w:tcPr>
     </w:tblStylePr>
   </w:style>
-  <w:style w:type="table" w:styleId="22">
+  <w:style w:type="table" w:styleId="711">
     <w:name w:val="Grid Table 1 Light - Accent 3"/>
-    <w:basedOn w:val="665"/>
+    <w:basedOn w:val="887"/>
     <w:uiPriority w:val="99"/>
     <w:pPr>
       <w:pBdr/>
@@ -2783,9 +3268,9 @@
       </w:tcPr>
     </w:tblStylePr>
   </w:style>
-  <w:style w:type="table" w:styleId="23">
+  <w:style w:type="table" w:styleId="712">
     <w:name w:val="Grid Table 1 Light - Accent 4"/>
-    <w:basedOn w:val="665"/>
+    <w:basedOn w:val="887"/>
     <w:uiPriority w:val="99"/>
     <w:pPr>
       <w:pBdr/>
@@ -3006,9 +3491,9 @@
       </w:tcPr>
     </w:tblStylePr>
   </w:style>
-  <w:style w:type="table" w:styleId="24">
+  <w:style w:type="table" w:styleId="713">
     <w:name w:val="Grid Table 1 Light - Accent 5"/>
-    <w:basedOn w:val="665"/>
+    <w:basedOn w:val="887"/>
     <w:uiPriority w:val="99"/>
     <w:pPr>
       <w:pBdr/>
@@ -3229,9 +3714,9 @@
       </w:tcPr>
     </w:tblStylePr>
   </w:style>
-  <w:style w:type="table" w:styleId="25">
+  <w:style w:type="table" w:styleId="714">
     <w:name w:val="Grid Table 1 Light - Accent 6"/>
-    <w:basedOn w:val="665"/>
+    <w:basedOn w:val="887"/>
     <w:uiPriority w:val="99"/>
     <w:pPr>
       <w:pBdr/>
@@ -3452,9 +3937,9 @@
       </w:tcPr>
     </w:tblStylePr>
   </w:style>
-  <w:style w:type="table" w:styleId="26">
+  <w:style w:type="table" w:styleId="715">
     <w:name w:val="Grid Table 2"/>
-    <w:basedOn w:val="665"/>
+    <w:basedOn w:val="887"/>
     <w:uiPriority w:val="99"/>
     <w:pPr>
       <w:pBdr/>
@@ -3684,9 +4169,9 @@
       </w:tcPr>
     </w:tblStylePr>
   </w:style>
-  <w:style w:type="table" w:styleId="27">
+  <w:style w:type="table" w:styleId="716">
     <w:name w:val="Grid Table 2 - Accent 1"/>
-    <w:basedOn w:val="665"/>
+    <w:basedOn w:val="887"/>
     <w:uiPriority w:val="99"/>
     <w:pPr>
       <w:pBdr/>
@@ -3916,9 +4401,9 @@
       </w:tcPr>
     </w:tblStylePr>
   </w:style>
-  <w:style w:type="table" w:styleId="28">
+  <w:style w:type="table" w:styleId="717">
     <w:name w:val="Grid Table 2 - Accent 2"/>
-    <w:basedOn w:val="665"/>
+    <w:basedOn w:val="887"/>
     <w:uiPriority w:val="99"/>
     <w:pPr>
       <w:pBdr/>
@@ -4148,9 +4633,9 @@
       </w:tcPr>
     </w:tblStylePr>
   </w:style>
-  <w:style w:type="table" w:styleId="29">
+  <w:style w:type="table" w:styleId="718">
     <w:name w:val="Grid Table 2 - Accent 3"/>
-    <w:basedOn w:val="665"/>
+    <w:basedOn w:val="887"/>
     <w:uiPriority w:val="99"/>
     <w:pPr>
       <w:pBdr/>
@@ -4380,9 +4865,9 @@
       </w:tcPr>
     </w:tblStylePr>
   </w:style>
-  <w:style w:type="table" w:styleId="30">
+  <w:style w:type="table" w:styleId="719">
     <w:name w:val="Grid Table 2 - Accent 4"/>
-    <w:basedOn w:val="665"/>
+    <w:basedOn w:val="887"/>
     <w:uiPriority w:val="99"/>
     <w:pPr>
       <w:pBdr/>
@@ -4612,9 +5097,9 @@
       </w:tcPr>
     </w:tblStylePr>
   </w:style>
-  <w:style w:type="table" w:styleId="31">
+  <w:style w:type="table" w:styleId="720">
     <w:name w:val="Grid Table 2 - Accent 5"/>
-    <w:basedOn w:val="665"/>
+    <w:basedOn w:val="887"/>
     <w:uiPriority w:val="99"/>
     <w:pPr>
       <w:pBdr/>
@@ -4844,9 +5329,9 @@
       </w:tcPr>
     </w:tblStylePr>
   </w:style>
-  <w:style w:type="table" w:styleId="32">
+  <w:style w:type="table" w:styleId="721">
     <w:name w:val="Grid Table 2 - Accent 6"/>
-    <w:basedOn w:val="665"/>
+    <w:basedOn w:val="887"/>
     <w:uiPriority w:val="99"/>
     <w:pPr>
       <w:pBdr/>
@@ -5076,9 +5561,9 @@
       </w:tcPr>
     </w:tblStylePr>
   </w:style>
-  <w:style w:type="table" w:styleId="33">
+  <w:style w:type="table" w:styleId="722">
     <w:name w:val="Grid Table 3"/>
-    <w:basedOn w:val="665"/>
+    <w:basedOn w:val="887"/>
     <w:uiPriority w:val="99"/>
     <w:pPr>
       <w:pBdr/>
@@ -5177,29 +5662,6 @@
         <w:tblBorders/>
       </w:tblPr>
       <w:tcPr>
-        <w:shd w:color="ffffff"/>
-        <w:tcBorders>
-          <w:top w:val="none" w:color="000000" w:sz="4" w:space="0"/>
-          <w:left w:val="none" w:color="000000" w:sz="4" w:space="0"/>
-          <w:bottom w:val="none" w:color="000000" w:sz="4" w:space="0"/>
-          <w:right w:val="none" w:color="000000" w:sz="4" w:space="0"/>
-        </w:tcBorders>
-      </w:tcPr>
-    </w:tblStylePr>
-    <w:tblStylePr w:type="firstRow">
-      <w:rPr>
-        <w:b/>
-        <w:color w:val="404040"/>
-      </w:rPr>
-      <w:pPr>
-        <w:pBdr/>
-        <w:spacing/>
-        <w:ind/>
-      </w:pPr>
-      <w:tblPr>
-        <w:tblBorders/>
-      </w:tblPr>
-      <w:tcPr>
         <w:shd w:val="clear" w:color="ffffff"/>
         <w:tcBorders>
           <w:top w:val="none" w:color="000000" w:sz="4" w:space="0"/>
@@ -5209,30 +5671,7 @@
         </w:tcBorders>
       </w:tcPr>
     </w:tblStylePr>
-    <w:tblStylePr w:type="lastCol">
-      <w:rPr>
-        <w:i/>
-        <w:color w:val="404040"/>
-      </w:rPr>
-      <w:pPr>
-        <w:pBdr/>
-        <w:spacing/>
-        <w:ind/>
-      </w:pPr>
-      <w:tblPr>
-        <w:tblBorders/>
-      </w:tblPr>
-      <w:tcPr>
-        <w:shd w:color="ffffff"/>
-        <w:tcBorders>
-          <w:top w:val="none" w:color="000000" w:sz="4" w:space="0"/>
-          <w:left w:val="none" w:color="000000" w:sz="4" w:space="0"/>
-          <w:bottom w:val="none" w:color="000000" w:sz="4" w:space="0"/>
-          <w:right w:val="none" w:color="000000" w:sz="4" w:space="0"/>
-        </w:tcBorders>
-      </w:tcPr>
-    </w:tblStylePr>
-    <w:tblStylePr w:type="lastRow">
+    <w:tblStylePr w:type="firstRow">
       <w:rPr>
         <w:b/>
         <w:color w:val="404040"/>
@@ -5255,6 +5694,52 @@
         </w:tcBorders>
       </w:tcPr>
     </w:tblStylePr>
+    <w:tblStylePr w:type="lastCol">
+      <w:rPr>
+        <w:i/>
+        <w:color w:val="404040"/>
+      </w:rPr>
+      <w:pPr>
+        <w:pBdr/>
+        <w:spacing/>
+        <w:ind/>
+      </w:pPr>
+      <w:tblPr>
+        <w:tblBorders/>
+      </w:tblPr>
+      <w:tcPr>
+        <w:shd w:val="clear" w:color="ffffff"/>
+        <w:tcBorders>
+          <w:top w:val="none" w:color="000000" w:sz="4" w:space="0"/>
+          <w:left w:val="none" w:color="000000" w:sz="4" w:space="0"/>
+          <w:bottom w:val="none" w:color="000000" w:sz="4" w:space="0"/>
+          <w:right w:val="none" w:color="000000" w:sz="4" w:space="0"/>
+        </w:tcBorders>
+      </w:tcPr>
+    </w:tblStylePr>
+    <w:tblStylePr w:type="lastRow">
+      <w:rPr>
+        <w:b/>
+        <w:color w:val="404040"/>
+      </w:rPr>
+      <w:pPr>
+        <w:pBdr/>
+        <w:spacing/>
+        <w:ind/>
+      </w:pPr>
+      <w:tblPr>
+        <w:tblBorders/>
+      </w:tblPr>
+      <w:tcPr>
+        <w:shd w:val="clear" w:color="ffffff"/>
+        <w:tcBorders>
+          <w:top w:val="none" w:color="000000" w:sz="4" w:space="0"/>
+          <w:left w:val="none" w:color="000000" w:sz="4" w:space="0"/>
+          <w:bottom w:val="none" w:color="000000" w:sz="4" w:space="0"/>
+          <w:right w:val="none" w:color="000000" w:sz="4" w:space="0"/>
+        </w:tcBorders>
+      </w:tcPr>
+    </w:tblStylePr>
     <w:tblStylePr w:type="nwCell">
       <w:pPr>
         <w:pBdr/>
@@ -5321,9 +5806,9 @@
       </w:tcPr>
     </w:tblStylePr>
   </w:style>
-  <w:style w:type="table" w:styleId="34">
+  <w:style w:type="table" w:styleId="723">
     <w:name w:val="Grid Table 3 - Accent 1"/>
-    <w:basedOn w:val="665"/>
+    <w:basedOn w:val="887"/>
     <w:uiPriority w:val="99"/>
     <w:pPr>
       <w:pBdr/>
@@ -5422,29 +5907,6 @@
         <w:tblBorders/>
       </w:tblPr>
       <w:tcPr>
-        <w:shd w:color="ffffff"/>
-        <w:tcBorders>
-          <w:top w:val="none" w:color="000000" w:sz="4" w:space="0"/>
-          <w:left w:val="none" w:color="000000" w:sz="4" w:space="0"/>
-          <w:bottom w:val="none" w:color="000000" w:sz="4" w:space="0"/>
-          <w:right w:val="none" w:color="000000" w:sz="4" w:space="0"/>
-        </w:tcBorders>
-      </w:tcPr>
-    </w:tblStylePr>
-    <w:tblStylePr w:type="firstRow">
-      <w:rPr>
-        <w:b/>
-        <w:color w:val="404040"/>
-      </w:rPr>
-      <w:pPr>
-        <w:pBdr/>
-        <w:spacing/>
-        <w:ind/>
-      </w:pPr>
-      <w:tblPr>
-        <w:tblBorders/>
-      </w:tblPr>
-      <w:tcPr>
         <w:shd w:val="clear" w:color="ffffff"/>
         <w:tcBorders>
           <w:top w:val="none" w:color="000000" w:sz="4" w:space="0"/>
@@ -5454,30 +5916,7 @@
         </w:tcBorders>
       </w:tcPr>
     </w:tblStylePr>
-    <w:tblStylePr w:type="lastCol">
-      <w:rPr>
-        <w:i/>
-        <w:color w:val="404040"/>
-      </w:rPr>
-      <w:pPr>
-        <w:pBdr/>
-        <w:spacing/>
-        <w:ind/>
-      </w:pPr>
-      <w:tblPr>
-        <w:tblBorders/>
-      </w:tblPr>
-      <w:tcPr>
-        <w:shd w:color="ffffff"/>
-        <w:tcBorders>
-          <w:top w:val="none" w:color="000000" w:sz="4" w:space="0"/>
-          <w:left w:val="none" w:color="000000" w:sz="4" w:space="0"/>
-          <w:bottom w:val="none" w:color="000000" w:sz="4" w:space="0"/>
-          <w:right w:val="none" w:color="000000" w:sz="4" w:space="0"/>
-        </w:tcBorders>
-      </w:tcPr>
-    </w:tblStylePr>
-    <w:tblStylePr w:type="lastRow">
+    <w:tblStylePr w:type="firstRow">
       <w:rPr>
         <w:b/>
         <w:color w:val="404040"/>
@@ -5500,6 +5939,52 @@
         </w:tcBorders>
       </w:tcPr>
     </w:tblStylePr>
+    <w:tblStylePr w:type="lastCol">
+      <w:rPr>
+        <w:i/>
+        <w:color w:val="404040"/>
+      </w:rPr>
+      <w:pPr>
+        <w:pBdr/>
+        <w:spacing/>
+        <w:ind/>
+      </w:pPr>
+      <w:tblPr>
+        <w:tblBorders/>
+      </w:tblPr>
+      <w:tcPr>
+        <w:shd w:val="clear" w:color="ffffff"/>
+        <w:tcBorders>
+          <w:top w:val="none" w:color="000000" w:sz="4" w:space="0"/>
+          <w:left w:val="none" w:color="000000" w:sz="4" w:space="0"/>
+          <w:bottom w:val="none" w:color="000000" w:sz="4" w:space="0"/>
+          <w:right w:val="none" w:color="000000" w:sz="4" w:space="0"/>
+        </w:tcBorders>
+      </w:tcPr>
+    </w:tblStylePr>
+    <w:tblStylePr w:type="lastRow">
+      <w:rPr>
+        <w:b/>
+        <w:color w:val="404040"/>
+      </w:rPr>
+      <w:pPr>
+        <w:pBdr/>
+        <w:spacing/>
+        <w:ind/>
+      </w:pPr>
+      <w:tblPr>
+        <w:tblBorders/>
+      </w:tblPr>
+      <w:tcPr>
+        <w:shd w:val="clear" w:color="ffffff"/>
+        <w:tcBorders>
+          <w:top w:val="none" w:color="000000" w:sz="4" w:space="0"/>
+          <w:left w:val="none" w:color="000000" w:sz="4" w:space="0"/>
+          <w:bottom w:val="none" w:color="000000" w:sz="4" w:space="0"/>
+          <w:right w:val="none" w:color="000000" w:sz="4" w:space="0"/>
+        </w:tcBorders>
+      </w:tcPr>
+    </w:tblStylePr>
     <w:tblStylePr w:type="nwCell">
       <w:pPr>
         <w:pBdr/>
@@ -5566,9 +6051,9 @@
       </w:tcPr>
     </w:tblStylePr>
   </w:style>
-  <w:style w:type="table" w:styleId="35">
+  <w:style w:type="table" w:styleId="724">
     <w:name w:val="Grid Table 3 - Accent 2"/>
-    <w:basedOn w:val="665"/>
+    <w:basedOn w:val="887"/>
     <w:uiPriority w:val="99"/>
     <w:pPr>
       <w:pBdr/>
@@ -5667,29 +6152,6 @@
         <w:tblBorders/>
       </w:tblPr>
       <w:tcPr>
-        <w:shd w:color="ffffff"/>
-        <w:tcBorders>
-          <w:top w:val="none" w:color="000000" w:sz="4" w:space="0"/>
-          <w:left w:val="none" w:color="000000" w:sz="4" w:space="0"/>
-          <w:bottom w:val="none" w:color="000000" w:sz="4" w:space="0"/>
-          <w:right w:val="none" w:color="000000" w:sz="4" w:space="0"/>
-        </w:tcBorders>
-      </w:tcPr>
-    </w:tblStylePr>
-    <w:tblStylePr w:type="firstRow">
-      <w:rPr>
-        <w:b/>
-        <w:color w:val="404040"/>
-      </w:rPr>
-      <w:pPr>
-        <w:pBdr/>
-        <w:spacing/>
-        <w:ind/>
-      </w:pPr>
-      <w:tblPr>
-        <w:tblBorders/>
-      </w:tblPr>
-      <w:tcPr>
         <w:shd w:val="clear" w:color="ffffff"/>
         <w:tcBorders>
           <w:top w:val="none" w:color="000000" w:sz="4" w:space="0"/>
@@ -5699,30 +6161,7 @@
         </w:tcBorders>
       </w:tcPr>
     </w:tblStylePr>
-    <w:tblStylePr w:type="lastCol">
-      <w:rPr>
-        <w:i/>
-        <w:color w:val="404040"/>
-      </w:rPr>
-      <w:pPr>
-        <w:pBdr/>
-        <w:spacing/>
-        <w:ind/>
-      </w:pPr>
-      <w:tblPr>
-        <w:tblBorders/>
-      </w:tblPr>
-      <w:tcPr>
-        <w:shd w:color="ffffff"/>
-        <w:tcBorders>
-          <w:top w:val="none" w:color="000000" w:sz="4" w:space="0"/>
-          <w:left w:val="none" w:color="000000" w:sz="4" w:space="0"/>
-          <w:bottom w:val="none" w:color="000000" w:sz="4" w:space="0"/>
-          <w:right w:val="none" w:color="000000" w:sz="4" w:space="0"/>
-        </w:tcBorders>
-      </w:tcPr>
-    </w:tblStylePr>
-    <w:tblStylePr w:type="lastRow">
+    <w:tblStylePr w:type="firstRow">
       <w:rPr>
         <w:b/>
         <w:color w:val="404040"/>
@@ -5745,6 +6184,52 @@
         </w:tcBorders>
       </w:tcPr>
     </w:tblStylePr>
+    <w:tblStylePr w:type="lastCol">
+      <w:rPr>
+        <w:i/>
+        <w:color w:val="404040"/>
+      </w:rPr>
+      <w:pPr>
+        <w:pBdr/>
+        <w:spacing/>
+        <w:ind/>
+      </w:pPr>
+      <w:tblPr>
+        <w:tblBorders/>
+      </w:tblPr>
+      <w:tcPr>
+        <w:shd w:val="clear" w:color="ffffff"/>
+        <w:tcBorders>
+          <w:top w:val="none" w:color="000000" w:sz="4" w:space="0"/>
+          <w:left w:val="none" w:color="000000" w:sz="4" w:space="0"/>
+          <w:bottom w:val="none" w:color="000000" w:sz="4" w:space="0"/>
+          <w:right w:val="none" w:color="000000" w:sz="4" w:space="0"/>
+        </w:tcBorders>
+      </w:tcPr>
+    </w:tblStylePr>
+    <w:tblStylePr w:type="lastRow">
+      <w:rPr>
+        <w:b/>
+        <w:color w:val="404040"/>
+      </w:rPr>
+      <w:pPr>
+        <w:pBdr/>
+        <w:spacing/>
+        <w:ind/>
+      </w:pPr>
+      <w:tblPr>
+        <w:tblBorders/>
+      </w:tblPr>
+      <w:tcPr>
+        <w:shd w:val="clear" w:color="ffffff"/>
+        <w:tcBorders>
+          <w:top w:val="none" w:color="000000" w:sz="4" w:space="0"/>
+          <w:left w:val="none" w:color="000000" w:sz="4" w:space="0"/>
+          <w:bottom w:val="none" w:color="000000" w:sz="4" w:space="0"/>
+          <w:right w:val="none" w:color="000000" w:sz="4" w:space="0"/>
+        </w:tcBorders>
+      </w:tcPr>
+    </w:tblStylePr>
     <w:tblStylePr w:type="nwCell">
       <w:pPr>
         <w:pBdr/>
@@ -5811,9 +6296,9 @@
       </w:tcPr>
     </w:tblStylePr>
   </w:style>
-  <w:style w:type="table" w:styleId="36">
+  <w:style w:type="table" w:styleId="725">
     <w:name w:val="Grid Table 3 - Accent 3"/>
-    <w:basedOn w:val="665"/>
+    <w:basedOn w:val="887"/>
     <w:uiPriority w:val="99"/>
     <w:pPr>
       <w:pBdr/>
@@ -5912,29 +6397,6 @@
         <w:tblBorders/>
       </w:tblPr>
       <w:tcPr>
-        <w:shd w:color="ffffff"/>
-        <w:tcBorders>
-          <w:top w:val="none" w:color="000000" w:sz="4" w:space="0"/>
-          <w:left w:val="none" w:color="000000" w:sz="4" w:space="0"/>
-          <w:bottom w:val="none" w:color="000000" w:sz="4" w:space="0"/>
-          <w:right w:val="none" w:color="000000" w:sz="4" w:space="0"/>
-        </w:tcBorders>
-      </w:tcPr>
-    </w:tblStylePr>
-    <w:tblStylePr w:type="firstRow">
-      <w:rPr>
-        <w:b/>
-        <w:color w:val="404040"/>
-      </w:rPr>
-      <w:pPr>
-        <w:pBdr/>
-        <w:spacing/>
-        <w:ind/>
-      </w:pPr>
-      <w:tblPr>
-        <w:tblBorders/>
-      </w:tblPr>
-      <w:tcPr>
         <w:shd w:val="clear" w:color="ffffff"/>
         <w:tcBorders>
           <w:top w:val="none" w:color="000000" w:sz="4" w:space="0"/>
@@ -5944,30 +6406,7 @@
         </w:tcBorders>
       </w:tcPr>
     </w:tblStylePr>
-    <w:tblStylePr w:type="lastCol">
-      <w:rPr>
-        <w:i/>
-        <w:color w:val="404040"/>
-      </w:rPr>
-      <w:pPr>
-        <w:pBdr/>
-        <w:spacing/>
-        <w:ind/>
-      </w:pPr>
-      <w:tblPr>
-        <w:tblBorders/>
-      </w:tblPr>
-      <w:tcPr>
-        <w:shd w:color="ffffff"/>
-        <w:tcBorders>
-          <w:top w:val="none" w:color="000000" w:sz="4" w:space="0"/>
-          <w:left w:val="none" w:color="000000" w:sz="4" w:space="0"/>
-          <w:bottom w:val="none" w:color="000000" w:sz="4" w:space="0"/>
-          <w:right w:val="none" w:color="000000" w:sz="4" w:space="0"/>
-        </w:tcBorders>
-      </w:tcPr>
-    </w:tblStylePr>
-    <w:tblStylePr w:type="lastRow">
+    <w:tblStylePr w:type="firstRow">
       <w:rPr>
         <w:b/>
         <w:color w:val="404040"/>
@@ -5990,6 +6429,52 @@
         </w:tcBorders>
       </w:tcPr>
     </w:tblStylePr>
+    <w:tblStylePr w:type="lastCol">
+      <w:rPr>
+        <w:i/>
+        <w:color w:val="404040"/>
+      </w:rPr>
+      <w:pPr>
+        <w:pBdr/>
+        <w:spacing/>
+        <w:ind/>
+      </w:pPr>
+      <w:tblPr>
+        <w:tblBorders/>
+      </w:tblPr>
+      <w:tcPr>
+        <w:shd w:val="clear" w:color="ffffff"/>
+        <w:tcBorders>
+          <w:top w:val="none" w:color="000000" w:sz="4" w:space="0"/>
+          <w:left w:val="none" w:color="000000" w:sz="4" w:space="0"/>
+          <w:bottom w:val="none" w:color="000000" w:sz="4" w:space="0"/>
+          <w:right w:val="none" w:color="000000" w:sz="4" w:space="0"/>
+        </w:tcBorders>
+      </w:tcPr>
+    </w:tblStylePr>
+    <w:tblStylePr w:type="lastRow">
+      <w:rPr>
+        <w:b/>
+        <w:color w:val="404040"/>
+      </w:rPr>
+      <w:pPr>
+        <w:pBdr/>
+        <w:spacing/>
+        <w:ind/>
+      </w:pPr>
+      <w:tblPr>
+        <w:tblBorders/>
+      </w:tblPr>
+      <w:tcPr>
+        <w:shd w:val="clear" w:color="ffffff"/>
+        <w:tcBorders>
+          <w:top w:val="none" w:color="000000" w:sz="4" w:space="0"/>
+          <w:left w:val="none" w:color="000000" w:sz="4" w:space="0"/>
+          <w:bottom w:val="none" w:color="000000" w:sz="4" w:space="0"/>
+          <w:right w:val="none" w:color="000000" w:sz="4" w:space="0"/>
+        </w:tcBorders>
+      </w:tcPr>
+    </w:tblStylePr>
     <w:tblStylePr w:type="nwCell">
       <w:pPr>
         <w:pBdr/>
@@ -6056,9 +6541,9 @@
       </w:tcPr>
     </w:tblStylePr>
   </w:style>
-  <w:style w:type="table" w:styleId="37">
+  <w:style w:type="table" w:styleId="726">
     <w:name w:val="Grid Table 3 - Accent 4"/>
-    <w:basedOn w:val="665"/>
+    <w:basedOn w:val="887"/>
     <w:uiPriority w:val="99"/>
     <w:pPr>
       <w:pBdr/>
@@ -6157,29 +6642,6 @@
         <w:tblBorders/>
       </w:tblPr>
       <w:tcPr>
-        <w:shd w:color="ffffff"/>
-        <w:tcBorders>
-          <w:top w:val="none" w:color="000000" w:sz="4" w:space="0"/>
-          <w:left w:val="none" w:color="000000" w:sz="4" w:space="0"/>
-          <w:bottom w:val="none" w:color="000000" w:sz="4" w:space="0"/>
-          <w:right w:val="none" w:color="000000" w:sz="4" w:space="0"/>
-        </w:tcBorders>
-      </w:tcPr>
-    </w:tblStylePr>
-    <w:tblStylePr w:type="firstRow">
-      <w:rPr>
-        <w:b/>
-        <w:color w:val="404040"/>
-      </w:rPr>
-      <w:pPr>
-        <w:pBdr/>
-        <w:spacing/>
-        <w:ind/>
-      </w:pPr>
-      <w:tblPr>
-        <w:tblBorders/>
-      </w:tblPr>
-      <w:tcPr>
         <w:shd w:val="clear" w:color="ffffff"/>
         <w:tcBorders>
           <w:top w:val="none" w:color="000000" w:sz="4" w:space="0"/>
@@ -6189,30 +6651,7 @@
         </w:tcBorders>
       </w:tcPr>
     </w:tblStylePr>
-    <w:tblStylePr w:type="lastCol">
-      <w:rPr>
-        <w:i/>
-        <w:color w:val="404040"/>
-      </w:rPr>
-      <w:pPr>
-        <w:pBdr/>
-        <w:spacing/>
-        <w:ind/>
-      </w:pPr>
-      <w:tblPr>
-        <w:tblBorders/>
-      </w:tblPr>
-      <w:tcPr>
-        <w:shd w:color="ffffff"/>
-        <w:tcBorders>
-          <w:top w:val="none" w:color="000000" w:sz="4" w:space="0"/>
-          <w:left w:val="none" w:color="000000" w:sz="4" w:space="0"/>
-          <w:bottom w:val="none" w:color="000000" w:sz="4" w:space="0"/>
-          <w:right w:val="none" w:color="000000" w:sz="4" w:space="0"/>
-        </w:tcBorders>
-      </w:tcPr>
-    </w:tblStylePr>
-    <w:tblStylePr w:type="lastRow">
+    <w:tblStylePr w:type="firstRow">
       <w:rPr>
         <w:b/>
         <w:color w:val="404040"/>
@@ -6235,6 +6674,52 @@
         </w:tcBorders>
       </w:tcPr>
     </w:tblStylePr>
+    <w:tblStylePr w:type="lastCol">
+      <w:rPr>
+        <w:i/>
+        <w:color w:val="404040"/>
+      </w:rPr>
+      <w:pPr>
+        <w:pBdr/>
+        <w:spacing/>
+        <w:ind/>
+      </w:pPr>
+      <w:tblPr>
+        <w:tblBorders/>
+      </w:tblPr>
+      <w:tcPr>
+        <w:shd w:val="clear" w:color="ffffff"/>
+        <w:tcBorders>
+          <w:top w:val="none" w:color="000000" w:sz="4" w:space="0"/>
+          <w:left w:val="none" w:color="000000" w:sz="4" w:space="0"/>
+          <w:bottom w:val="none" w:color="000000" w:sz="4" w:space="0"/>
+          <w:right w:val="none" w:color="000000" w:sz="4" w:space="0"/>
+        </w:tcBorders>
+      </w:tcPr>
+    </w:tblStylePr>
+    <w:tblStylePr w:type="lastRow">
+      <w:rPr>
+        <w:b/>
+        <w:color w:val="404040"/>
+      </w:rPr>
+      <w:pPr>
+        <w:pBdr/>
+        <w:spacing/>
+        <w:ind/>
+      </w:pPr>
+      <w:tblPr>
+        <w:tblBorders/>
+      </w:tblPr>
+      <w:tcPr>
+        <w:shd w:val="clear" w:color="ffffff"/>
+        <w:tcBorders>
+          <w:top w:val="none" w:color="000000" w:sz="4" w:space="0"/>
+          <w:left w:val="none" w:color="000000" w:sz="4" w:space="0"/>
+          <w:bottom w:val="none" w:color="000000" w:sz="4" w:space="0"/>
+          <w:right w:val="none" w:color="000000" w:sz="4" w:space="0"/>
+        </w:tcBorders>
+      </w:tcPr>
+    </w:tblStylePr>
     <w:tblStylePr w:type="nwCell">
       <w:pPr>
         <w:pBdr/>
@@ -6301,9 +6786,9 @@
       </w:tcPr>
     </w:tblStylePr>
   </w:style>
-  <w:style w:type="table" w:styleId="38">
+  <w:style w:type="table" w:styleId="727">
     <w:name w:val="Grid Table 3 - Accent 5"/>
-    <w:basedOn w:val="665"/>
+    <w:basedOn w:val="887"/>
     <w:uiPriority w:val="99"/>
     <w:pPr>
       <w:pBdr/>
@@ -6402,29 +6887,6 @@
         <w:tblBorders/>
       </w:tblPr>
       <w:tcPr>
-        <w:shd w:color="ffffff"/>
-        <w:tcBorders>
-          <w:top w:val="none" w:color="000000" w:sz="4" w:space="0"/>
-          <w:left w:val="none" w:color="000000" w:sz="4" w:space="0"/>
-          <w:bottom w:val="none" w:color="000000" w:sz="4" w:space="0"/>
-          <w:right w:val="none" w:color="000000" w:sz="4" w:space="0"/>
-        </w:tcBorders>
-      </w:tcPr>
-    </w:tblStylePr>
-    <w:tblStylePr w:type="firstRow">
-      <w:rPr>
-        <w:b/>
-        <w:color w:val="404040"/>
-      </w:rPr>
-      <w:pPr>
-        <w:pBdr/>
-        <w:spacing/>
-        <w:ind/>
-      </w:pPr>
-      <w:tblPr>
-        <w:tblBorders/>
-      </w:tblPr>
-      <w:tcPr>
         <w:shd w:val="clear" w:color="ffffff"/>
         <w:tcBorders>
           <w:top w:val="none" w:color="000000" w:sz="4" w:space="0"/>
@@ -6434,30 +6896,7 @@
         </w:tcBorders>
       </w:tcPr>
     </w:tblStylePr>
-    <w:tblStylePr w:type="lastCol">
-      <w:rPr>
-        <w:i/>
-        <w:color w:val="404040"/>
-      </w:rPr>
-      <w:pPr>
-        <w:pBdr/>
-        <w:spacing/>
-        <w:ind/>
-      </w:pPr>
-      <w:tblPr>
-        <w:tblBorders/>
-      </w:tblPr>
-      <w:tcPr>
-        <w:shd w:color="ffffff"/>
-        <w:tcBorders>
-          <w:top w:val="none" w:color="000000" w:sz="4" w:space="0"/>
-          <w:left w:val="none" w:color="000000" w:sz="4" w:space="0"/>
-          <w:bottom w:val="none" w:color="000000" w:sz="4" w:space="0"/>
-          <w:right w:val="none" w:color="000000" w:sz="4" w:space="0"/>
-        </w:tcBorders>
-      </w:tcPr>
-    </w:tblStylePr>
-    <w:tblStylePr w:type="lastRow">
+    <w:tblStylePr w:type="firstRow">
       <w:rPr>
         <w:b/>
         <w:color w:val="404040"/>
@@ -6480,6 +6919,52 @@
         </w:tcBorders>
       </w:tcPr>
     </w:tblStylePr>
+    <w:tblStylePr w:type="lastCol">
+      <w:rPr>
+        <w:i/>
+        <w:color w:val="404040"/>
+      </w:rPr>
+      <w:pPr>
+        <w:pBdr/>
+        <w:spacing/>
+        <w:ind/>
+      </w:pPr>
+      <w:tblPr>
+        <w:tblBorders/>
+      </w:tblPr>
+      <w:tcPr>
+        <w:shd w:val="clear" w:color="ffffff"/>
+        <w:tcBorders>
+          <w:top w:val="none" w:color="000000" w:sz="4" w:space="0"/>
+          <w:left w:val="none" w:color="000000" w:sz="4" w:space="0"/>
+          <w:bottom w:val="none" w:color="000000" w:sz="4" w:space="0"/>
+          <w:right w:val="none" w:color="000000" w:sz="4" w:space="0"/>
+        </w:tcBorders>
+      </w:tcPr>
+    </w:tblStylePr>
+    <w:tblStylePr w:type="lastRow">
+      <w:rPr>
+        <w:b/>
+        <w:color w:val="404040"/>
+      </w:rPr>
+      <w:pPr>
+        <w:pBdr/>
+        <w:spacing/>
+        <w:ind/>
+      </w:pPr>
+      <w:tblPr>
+        <w:tblBorders/>
+      </w:tblPr>
+      <w:tcPr>
+        <w:shd w:val="clear" w:color="ffffff"/>
+        <w:tcBorders>
+          <w:top w:val="none" w:color="000000" w:sz="4" w:space="0"/>
+          <w:left w:val="none" w:color="000000" w:sz="4" w:space="0"/>
+          <w:bottom w:val="none" w:color="000000" w:sz="4" w:space="0"/>
+          <w:right w:val="none" w:color="000000" w:sz="4" w:space="0"/>
+        </w:tcBorders>
+      </w:tcPr>
+    </w:tblStylePr>
     <w:tblStylePr w:type="nwCell">
       <w:pPr>
         <w:pBdr/>
@@ -6546,9 +7031,9 @@
       </w:tcPr>
     </w:tblStylePr>
   </w:style>
-  <w:style w:type="table" w:styleId="39">
+  <w:style w:type="table" w:styleId="728">
     <w:name w:val="Grid Table 3 - Accent 6"/>
-    <w:basedOn w:val="665"/>
+    <w:basedOn w:val="887"/>
     <w:uiPriority w:val="99"/>
     <w:pPr>
       <w:pBdr/>
@@ -6647,29 +7132,6 @@
         <w:tblBorders/>
       </w:tblPr>
       <w:tcPr>
-        <w:shd w:color="ffffff"/>
-        <w:tcBorders>
-          <w:top w:val="none" w:color="000000" w:sz="4" w:space="0"/>
-          <w:left w:val="none" w:color="000000" w:sz="4" w:space="0"/>
-          <w:bottom w:val="none" w:color="000000" w:sz="4" w:space="0"/>
-          <w:right w:val="none" w:color="000000" w:sz="4" w:space="0"/>
-        </w:tcBorders>
-      </w:tcPr>
-    </w:tblStylePr>
-    <w:tblStylePr w:type="firstRow">
-      <w:rPr>
-        <w:b/>
-        <w:color w:val="404040"/>
-      </w:rPr>
-      <w:pPr>
-        <w:pBdr/>
-        <w:spacing/>
-        <w:ind/>
-      </w:pPr>
-      <w:tblPr>
-        <w:tblBorders/>
-      </w:tblPr>
-      <w:tcPr>
         <w:shd w:val="clear" w:color="ffffff"/>
         <w:tcBorders>
           <w:top w:val="none" w:color="000000" w:sz="4" w:space="0"/>
@@ -6679,30 +7141,7 @@
         </w:tcBorders>
       </w:tcPr>
     </w:tblStylePr>
-    <w:tblStylePr w:type="lastCol">
-      <w:rPr>
-        <w:i/>
-        <w:color w:val="404040"/>
-      </w:rPr>
-      <w:pPr>
-        <w:pBdr/>
-        <w:spacing/>
-        <w:ind/>
-      </w:pPr>
-      <w:tblPr>
-        <w:tblBorders/>
-      </w:tblPr>
-      <w:tcPr>
-        <w:shd w:color="ffffff"/>
-        <w:tcBorders>
-          <w:top w:val="none" w:color="000000" w:sz="4" w:space="0"/>
-          <w:left w:val="none" w:color="000000" w:sz="4" w:space="0"/>
-          <w:bottom w:val="none" w:color="000000" w:sz="4" w:space="0"/>
-          <w:right w:val="none" w:color="000000" w:sz="4" w:space="0"/>
-        </w:tcBorders>
-      </w:tcPr>
-    </w:tblStylePr>
-    <w:tblStylePr w:type="lastRow">
+    <w:tblStylePr w:type="firstRow">
       <w:rPr>
         <w:b/>
         <w:color w:val="404040"/>
@@ -6725,6 +7164,52 @@
         </w:tcBorders>
       </w:tcPr>
     </w:tblStylePr>
+    <w:tblStylePr w:type="lastCol">
+      <w:rPr>
+        <w:i/>
+        <w:color w:val="404040"/>
+      </w:rPr>
+      <w:pPr>
+        <w:pBdr/>
+        <w:spacing/>
+        <w:ind/>
+      </w:pPr>
+      <w:tblPr>
+        <w:tblBorders/>
+      </w:tblPr>
+      <w:tcPr>
+        <w:shd w:val="clear" w:color="ffffff"/>
+        <w:tcBorders>
+          <w:top w:val="none" w:color="000000" w:sz="4" w:space="0"/>
+          <w:left w:val="none" w:color="000000" w:sz="4" w:space="0"/>
+          <w:bottom w:val="none" w:color="000000" w:sz="4" w:space="0"/>
+          <w:right w:val="none" w:color="000000" w:sz="4" w:space="0"/>
+        </w:tcBorders>
+      </w:tcPr>
+    </w:tblStylePr>
+    <w:tblStylePr w:type="lastRow">
+      <w:rPr>
+        <w:b/>
+        <w:color w:val="404040"/>
+      </w:rPr>
+      <w:pPr>
+        <w:pBdr/>
+        <w:spacing/>
+        <w:ind/>
+      </w:pPr>
+      <w:tblPr>
+        <w:tblBorders/>
+      </w:tblPr>
+      <w:tcPr>
+        <w:shd w:val="clear" w:color="ffffff"/>
+        <w:tcBorders>
+          <w:top w:val="none" w:color="000000" w:sz="4" w:space="0"/>
+          <w:left w:val="none" w:color="000000" w:sz="4" w:space="0"/>
+          <w:bottom w:val="none" w:color="000000" w:sz="4" w:space="0"/>
+          <w:right w:val="none" w:color="000000" w:sz="4" w:space="0"/>
+        </w:tcBorders>
+      </w:tcPr>
+    </w:tblStylePr>
     <w:tblStylePr w:type="nwCell">
       <w:pPr>
         <w:pBdr/>
@@ -6791,9 +7276,9 @@
       </w:tcPr>
     </w:tblStylePr>
   </w:style>
-  <w:style w:type="table" w:styleId="40">
+  <w:style w:type="table" w:styleId="729">
     <w:name w:val="Grid Table 4"/>
-    <w:basedOn w:val="665"/>
+    <w:basedOn w:val="887"/>
     <w:uiPriority w:val="59"/>
     <w:pPr>
       <w:pBdr/>
@@ -7024,9 +7509,9 @@
       </w:tcPr>
     </w:tblStylePr>
   </w:style>
-  <w:style w:type="table" w:styleId="41">
+  <w:style w:type="table" w:styleId="730">
     <w:name w:val="Grid Table 4 - Accent 1"/>
-    <w:basedOn w:val="665"/>
+    <w:basedOn w:val="887"/>
     <w:uiPriority w:val="59"/>
     <w:pPr>
       <w:pBdr/>
@@ -7257,9 +7742,9 @@
       </w:tcPr>
     </w:tblStylePr>
   </w:style>
-  <w:style w:type="table" w:styleId="42">
+  <w:style w:type="table" w:styleId="731">
     <w:name w:val="Grid Table 4 - Accent 2"/>
-    <w:basedOn w:val="665"/>
+    <w:basedOn w:val="887"/>
     <w:uiPriority w:val="59"/>
     <w:pPr>
       <w:pBdr/>
@@ -7490,9 +7975,9 @@
       </w:tcPr>
     </w:tblStylePr>
   </w:style>
-  <w:style w:type="table" w:styleId="43">
+  <w:style w:type="table" w:styleId="732">
     <w:name w:val="Grid Table 4 - Accent 3"/>
-    <w:basedOn w:val="665"/>
+    <w:basedOn w:val="887"/>
     <w:uiPriority w:val="59"/>
     <w:pPr>
       <w:pBdr/>
@@ -7723,9 +8208,9 @@
       </w:tcPr>
     </w:tblStylePr>
   </w:style>
-  <w:style w:type="table" w:styleId="44">
+  <w:style w:type="table" w:styleId="733">
     <w:name w:val="Grid Table 4 - Accent 4"/>
-    <w:basedOn w:val="665"/>
+    <w:basedOn w:val="887"/>
     <w:uiPriority w:val="59"/>
     <w:pPr>
       <w:pBdr/>
@@ -7956,9 +8441,9 @@
       </w:tcPr>
     </w:tblStylePr>
   </w:style>
-  <w:style w:type="table" w:styleId="45">
+  <w:style w:type="table" w:styleId="734">
     <w:name w:val="Grid Table 4 - Accent 5"/>
-    <w:basedOn w:val="665"/>
+    <w:basedOn w:val="887"/>
     <w:uiPriority w:val="59"/>
     <w:pPr>
       <w:pBdr/>
@@ -8189,9 +8674,9 @@
       </w:tcPr>
     </w:tblStylePr>
   </w:style>
-  <w:style w:type="table" w:styleId="46">
+  <w:style w:type="table" w:styleId="735">
     <w:name w:val="Grid Table 4 - Accent 6"/>
-    <w:basedOn w:val="665"/>
+    <w:basedOn w:val="887"/>
     <w:uiPriority w:val="59"/>
     <w:pPr>
       <w:pBdr/>
@@ -8422,9 +8907,9 @@
       </w:tcPr>
     </w:tblStylePr>
   </w:style>
-  <w:style w:type="table" w:styleId="47">
+  <w:style w:type="table" w:styleId="736">
     <w:name w:val="Grid Table 5 Dark"/>
-    <w:basedOn w:val="665"/>
+    <w:basedOn w:val="887"/>
     <w:uiPriority w:val="99"/>
     <w:pPr>
       <w:pBdr/>
@@ -8650,9 +9135,9 @@
       </w:tcPr>
     </w:tblStylePr>
   </w:style>
-  <w:style w:type="table" w:styleId="48">
+  <w:style w:type="table" w:styleId="737">
     <w:name w:val="Grid Table 5 Dark- Accent 1"/>
-    <w:basedOn w:val="665"/>
+    <w:basedOn w:val="887"/>
     <w:uiPriority w:val="99"/>
     <w:pPr>
       <w:pBdr/>
@@ -8878,9 +9363,9 @@
       </w:tcPr>
     </w:tblStylePr>
   </w:style>
-  <w:style w:type="table" w:styleId="49">
+  <w:style w:type="table" w:styleId="738">
     <w:name w:val="Grid Table 5 Dark - Accent 2"/>
-    <w:basedOn w:val="665"/>
+    <w:basedOn w:val="887"/>
     <w:uiPriority w:val="99"/>
     <w:pPr>
       <w:pBdr/>
@@ -9106,9 +9591,9 @@
       </w:tcPr>
     </w:tblStylePr>
   </w:style>
-  <w:style w:type="table" w:styleId="50">
+  <w:style w:type="table" w:styleId="739">
     <w:name w:val="Grid Table 5 Dark - Accent 3"/>
-    <w:basedOn w:val="665"/>
+    <w:basedOn w:val="887"/>
     <w:uiPriority w:val="99"/>
     <w:pPr>
       <w:pBdr/>
@@ -9334,9 +9819,9 @@
       </w:tcPr>
     </w:tblStylePr>
   </w:style>
-  <w:style w:type="table" w:styleId="51">
+  <w:style w:type="table" w:styleId="740">
     <w:name w:val="Grid Table 5 Dark- Accent 4"/>
-    <w:basedOn w:val="665"/>
+    <w:basedOn w:val="887"/>
     <w:uiPriority w:val="99"/>
     <w:pPr>
       <w:pBdr/>
@@ -9562,9 +10047,9 @@
       </w:tcPr>
     </w:tblStylePr>
   </w:style>
-  <w:style w:type="table" w:styleId="52">
+  <w:style w:type="table" w:styleId="741">
     <w:name w:val="Grid Table 5 Dark - Accent 5"/>
-    <w:basedOn w:val="665"/>
+    <w:basedOn w:val="887"/>
     <w:uiPriority w:val="99"/>
     <w:pPr>
       <w:pBdr/>
@@ -9790,9 +10275,9 @@
       </w:tcPr>
     </w:tblStylePr>
   </w:style>
-  <w:style w:type="table" w:styleId="53">
+  <w:style w:type="table" w:styleId="742">
     <w:name w:val="Grid Table 5 Dark - Accent 6"/>
-    <w:basedOn w:val="665"/>
+    <w:basedOn w:val="887"/>
     <w:uiPriority w:val="99"/>
     <w:pPr>
       <w:pBdr/>
@@ -10018,9 +10503,9 @@
       </w:tcPr>
     </w:tblStylePr>
   </w:style>
-  <w:style w:type="table" w:styleId="54">
+  <w:style w:type="table" w:styleId="743">
     <w:name w:val="Grid Table 6 Colorful"/>
-    <w:basedOn w:val="665"/>
+    <w:basedOn w:val="887"/>
     <w:uiPriority w:val="99"/>
     <w:pPr>
       <w:pBdr/>
@@ -10248,9 +10733,9 @@
       </w:tcPr>
     </w:tblStylePr>
   </w:style>
-  <w:style w:type="table" w:styleId="55">
+  <w:style w:type="table" w:styleId="744">
     <w:name w:val="Grid Table 6 Colorful - Accent 1"/>
-    <w:basedOn w:val="665"/>
+    <w:basedOn w:val="887"/>
     <w:uiPriority w:val="99"/>
     <w:pPr>
       <w:pBdr/>
@@ -10478,9 +10963,9 @@
       </w:tcPr>
     </w:tblStylePr>
   </w:style>
-  <w:style w:type="table" w:styleId="56">
+  <w:style w:type="table" w:styleId="745">
     <w:name w:val="Grid Table 6 Colorful - Accent 2"/>
-    <w:basedOn w:val="665"/>
+    <w:basedOn w:val="887"/>
     <w:uiPriority w:val="99"/>
     <w:pPr>
       <w:pBdr/>
@@ -10708,9 +11193,9 @@
       </w:tcPr>
     </w:tblStylePr>
   </w:style>
-  <w:style w:type="table" w:styleId="57">
+  <w:style w:type="table" w:styleId="746">
     <w:name w:val="Grid Table 6 Colorful - Accent 3"/>
-    <w:basedOn w:val="665"/>
+    <w:basedOn w:val="887"/>
     <w:uiPriority w:val="99"/>
     <w:pPr>
       <w:pBdr/>
@@ -10938,9 +11423,9 @@
       </w:tcPr>
     </w:tblStylePr>
   </w:style>
-  <w:style w:type="table" w:styleId="58">
+  <w:style w:type="table" w:styleId="747">
     <w:name w:val="Grid Table 6 Colorful - Accent 4"/>
-    <w:basedOn w:val="665"/>
+    <w:basedOn w:val="887"/>
     <w:uiPriority w:val="99"/>
     <w:pPr>
       <w:pBdr/>
@@ -11168,9 +11653,9 @@
       </w:tcPr>
     </w:tblStylePr>
   </w:style>
-  <w:style w:type="table" w:styleId="59">
+  <w:style w:type="table" w:styleId="748">
     <w:name w:val="Grid Table 6 Colorful - Accent 5"/>
-    <w:basedOn w:val="665"/>
+    <w:basedOn w:val="887"/>
     <w:uiPriority w:val="99"/>
     <w:pPr>
       <w:pBdr/>
@@ -11398,9 +11883,9 @@
       </w:tcPr>
     </w:tblStylePr>
   </w:style>
-  <w:style w:type="table" w:styleId="60">
+  <w:style w:type="table" w:styleId="749">
     <w:name w:val="Grid Table 6 Colorful - Accent 6"/>
-    <w:basedOn w:val="665"/>
+    <w:basedOn w:val="887"/>
     <w:uiPriority w:val="99"/>
     <w:pPr>
       <w:pBdr/>
@@ -11628,9 +12113,9 @@
       </w:tcPr>
     </w:tblStylePr>
   </w:style>
-  <w:style w:type="table" w:styleId="61">
+  <w:style w:type="table" w:styleId="750">
     <w:name w:val="Grid Table 7 Colorful"/>
-    <w:basedOn w:val="665"/>
+    <w:basedOn w:val="887"/>
     <w:uiPriority w:val="99"/>
     <w:pPr>
       <w:pBdr/>
@@ -11732,11 +12217,11 @@
         <w:tblBorders/>
       </w:tblPr>
       <w:tcPr>
-        <w:shd w:color="ffffff"/>
+        <w:shd w:val="clear" w:color="ffffff"/>
         <w:tcBorders>
-          <w:top w:val="none"/>
-          <w:left w:val="none"/>
-          <w:bottom w:val="none"/>
+          <w:top w:val="none" w:color="000000" w:sz="4" w:space="0"/>
+          <w:left w:val="none" w:color="000000" w:sz="4" w:space="0"/>
+          <w:bottom w:val="none" w:color="000000" w:sz="4" w:space="0"/>
           <w:right w:val="single" w:color="000000" w:themeColor="text1" w:themeTint="80" w:sz="4" w:space="0"/>
         </w:tcBorders>
       </w:tcPr>
@@ -11759,10 +12244,10 @@
       <w:tcPr>
         <w:shd w:val="clear" w:color="ffffff" w:themeColor="light1" w:fill="ffffff" w:themeFill="light1"/>
         <w:tcBorders>
-          <w:top w:val="none"/>
-          <w:left w:val="none"/>
+          <w:top w:val="none" w:color="000000" w:sz="4" w:space="0"/>
+          <w:left w:val="none" w:color="000000" w:sz="4" w:space="0"/>
           <w:bottom w:val="single" w:color="000000" w:themeColor="text1" w:themeTint="80" w:sz="4" w:space="0"/>
-          <w:right w:val="none"/>
+          <w:right w:val="none" w:color="000000" w:sz="4" w:space="0"/>
         </w:tcBorders>
       </w:tcPr>
     </w:tblStylePr>
@@ -11782,12 +12267,12 @@
         <w:tblBorders/>
       </w:tblPr>
       <w:tcPr>
-        <w:shd w:color="ffffff"/>
+        <w:shd w:val="clear" w:color="ffffff"/>
         <w:tcBorders>
-          <w:top w:val="none"/>
+          <w:top w:val="none" w:color="000000" w:sz="4" w:space="0"/>
           <w:left w:val="single" w:color="000000" w:themeColor="text1" w:themeTint="80" w:sz="4" w:space="0"/>
-          <w:bottom w:val="none"/>
-          <w:right w:val="none"/>
+          <w:bottom w:val="none" w:color="000000" w:sz="4" w:space="0"/>
+          <w:right w:val="none" w:color="000000" w:sz="4" w:space="0"/>
         </w:tcBorders>
       </w:tcPr>
     </w:tblStylePr>
@@ -11810,9 +12295,9 @@
         <w:shd w:val="clear" w:color="ffffff" w:themeColor="light1" w:fill="ffffff" w:themeFill="light1"/>
         <w:tcBorders>
           <w:top w:val="single" w:color="000000" w:themeColor="text1" w:themeTint="80" w:sz="4" w:space="0"/>
-          <w:left w:val="none"/>
-          <w:bottom w:val="none"/>
-          <w:right w:val="none"/>
+          <w:left w:val="none" w:color="000000" w:sz="4" w:space="0"/>
+          <w:bottom w:val="none" w:color="000000" w:sz="4" w:space="0"/>
+          <w:right w:val="none" w:color="000000" w:sz="4" w:space="0"/>
         </w:tcBorders>
       </w:tcPr>
     </w:tblStylePr>
@@ -11882,9 +12367,9 @@
       </w:tcPr>
     </w:tblStylePr>
   </w:style>
-  <w:style w:type="table" w:styleId="62">
+  <w:style w:type="table" w:styleId="751">
     <w:name w:val="Grid Table 7 Colorful - Accent 1"/>
-    <w:basedOn w:val="665"/>
+    <w:basedOn w:val="887"/>
     <w:uiPriority w:val="99"/>
     <w:pPr>
       <w:pBdr/>
@@ -11986,11 +12471,11 @@
         <w:tblBorders/>
       </w:tblPr>
       <w:tcPr>
-        <w:shd w:color="ffffff"/>
+        <w:shd w:val="clear" w:color="ffffff"/>
         <w:tcBorders>
-          <w:top w:val="none"/>
-          <w:left w:val="none"/>
-          <w:bottom w:val="none"/>
+          <w:top w:val="none" w:color="000000" w:sz="4" w:space="0"/>
+          <w:left w:val="none" w:color="000000" w:sz="4" w:space="0"/>
+          <w:bottom w:val="none" w:color="000000" w:sz="4" w:space="0"/>
           <w:right w:val="single" w:color="000000" w:themeColor="accent1" w:themeTint="80" w:sz="4" w:space="0"/>
         </w:tcBorders>
       </w:tcPr>
@@ -12013,10 +12498,10 @@
       <w:tcPr>
         <w:shd w:val="clear" w:color="ffffff" w:themeColor="light1" w:fill="ffffff" w:themeFill="light1"/>
         <w:tcBorders>
-          <w:top w:val="none"/>
-          <w:left w:val="none"/>
+          <w:top w:val="none" w:color="000000" w:sz="4" w:space="0"/>
+          <w:left w:val="none" w:color="000000" w:sz="4" w:space="0"/>
           <w:bottom w:val="single" w:color="000000" w:themeColor="accent1" w:themeTint="80" w:sz="4" w:space="0"/>
-          <w:right w:val="none"/>
+          <w:right w:val="none" w:color="000000" w:sz="4" w:space="0"/>
         </w:tcBorders>
       </w:tcPr>
     </w:tblStylePr>
@@ -12036,12 +12521,12 @@
         <w:tblBorders/>
       </w:tblPr>
       <w:tcPr>
-        <w:shd w:color="ffffff"/>
+        <w:shd w:val="clear" w:color="ffffff"/>
         <w:tcBorders>
-          <w:top w:val="none"/>
+          <w:top w:val="none" w:color="000000" w:sz="4" w:space="0"/>
           <w:left w:val="single" w:color="000000" w:themeColor="accent1" w:themeTint="80" w:sz="4" w:space="0"/>
-          <w:bottom w:val="none"/>
-          <w:right w:val="none"/>
+          <w:bottom w:val="none" w:color="000000" w:sz="4" w:space="0"/>
+          <w:right w:val="none" w:color="000000" w:sz="4" w:space="0"/>
         </w:tcBorders>
       </w:tcPr>
     </w:tblStylePr>
@@ -12064,9 +12549,9 @@
         <w:shd w:val="clear" w:color="ffffff" w:themeColor="light1" w:fill="ffffff" w:themeFill="light1"/>
         <w:tcBorders>
           <w:top w:val="single" w:color="000000" w:themeColor="accent1" w:themeTint="80" w:sz="4" w:space="0"/>
-          <w:left w:val="none"/>
-          <w:bottom w:val="none"/>
-          <w:right w:val="none"/>
+          <w:left w:val="none" w:color="000000" w:sz="4" w:space="0"/>
+          <w:bottom w:val="none" w:color="000000" w:sz="4" w:space="0"/>
+          <w:right w:val="none" w:color="000000" w:sz="4" w:space="0"/>
         </w:tcBorders>
       </w:tcPr>
     </w:tblStylePr>
@@ -12136,9 +12621,9 @@
       </w:tcPr>
     </w:tblStylePr>
   </w:style>
-  <w:style w:type="table" w:styleId="63">
+  <w:style w:type="table" w:styleId="752">
     <w:name w:val="Grid Table 7 Colorful - Accent 2"/>
-    <w:basedOn w:val="665"/>
+    <w:basedOn w:val="887"/>
     <w:uiPriority w:val="99"/>
     <w:pPr>
       <w:pBdr/>
@@ -12240,11 +12725,11 @@
         <w:tblBorders/>
       </w:tblPr>
       <w:tcPr>
-        <w:shd w:color="ffffff"/>
+        <w:shd w:val="clear" w:color="ffffff"/>
         <w:tcBorders>
-          <w:top w:val="none"/>
-          <w:left w:val="none"/>
-          <w:bottom w:val="none"/>
+          <w:top w:val="none" w:color="000000" w:sz="4" w:space="0"/>
+          <w:left w:val="none" w:color="000000" w:sz="4" w:space="0"/>
+          <w:bottom w:val="none" w:color="000000" w:sz="4" w:space="0"/>
           <w:right w:val="single" w:color="000000" w:themeColor="accent2" w:themeTint="97" w:sz="4" w:space="0"/>
         </w:tcBorders>
       </w:tcPr>
@@ -12267,10 +12752,10 @@
       <w:tcPr>
         <w:shd w:val="clear" w:color="ffffff" w:themeColor="light1" w:fill="ffffff" w:themeFill="light1"/>
         <w:tcBorders>
-          <w:top w:val="none"/>
-          <w:left w:val="none"/>
+          <w:top w:val="none" w:color="000000" w:sz="4" w:space="0"/>
+          <w:left w:val="none" w:color="000000" w:sz="4" w:space="0"/>
           <w:bottom w:val="single" w:color="000000" w:themeColor="accent2" w:themeTint="97" w:sz="4" w:space="0"/>
-          <w:right w:val="none"/>
+          <w:right w:val="none" w:color="000000" w:sz="4" w:space="0"/>
         </w:tcBorders>
       </w:tcPr>
     </w:tblStylePr>
@@ -12290,12 +12775,12 @@
         <w:tblBorders/>
       </w:tblPr>
       <w:tcPr>
-        <w:shd w:color="ffffff"/>
+        <w:shd w:val="clear" w:color="ffffff"/>
         <w:tcBorders>
-          <w:top w:val="none"/>
+          <w:top w:val="none" w:color="000000" w:sz="4" w:space="0"/>
           <w:left w:val="single" w:color="000000" w:themeColor="accent2" w:themeTint="97" w:sz="4" w:space="0"/>
-          <w:bottom w:val="none"/>
-          <w:right w:val="none"/>
+          <w:bottom w:val="none" w:color="000000" w:sz="4" w:space="0"/>
+          <w:right w:val="none" w:color="000000" w:sz="4" w:space="0"/>
         </w:tcBorders>
       </w:tcPr>
     </w:tblStylePr>
@@ -12318,9 +12803,9 @@
         <w:shd w:val="clear" w:color="ffffff" w:themeColor="light1" w:fill="ffffff" w:themeFill="light1"/>
         <w:tcBorders>
           <w:top w:val="single" w:color="000000" w:themeColor="accent2" w:themeTint="97" w:sz="4" w:space="0"/>
-          <w:left w:val="none"/>
-          <w:bottom w:val="none"/>
-          <w:right w:val="none"/>
+          <w:left w:val="none" w:color="000000" w:sz="4" w:space="0"/>
+          <w:bottom w:val="none" w:color="000000" w:sz="4" w:space="0"/>
+          <w:right w:val="none" w:color="000000" w:sz="4" w:space="0"/>
         </w:tcBorders>
       </w:tcPr>
     </w:tblStylePr>
@@ -12390,9 +12875,9 @@
       </w:tcPr>
     </w:tblStylePr>
   </w:style>
-  <w:style w:type="table" w:styleId="64">
+  <w:style w:type="table" w:styleId="753">
     <w:name w:val="Grid Table 7 Colorful - Accent 3"/>
-    <w:basedOn w:val="665"/>
+    <w:basedOn w:val="887"/>
     <w:uiPriority w:val="99"/>
     <w:pPr>
       <w:pBdr/>
@@ -12494,11 +12979,11 @@
         <w:tblBorders/>
       </w:tblPr>
       <w:tcPr>
-        <w:shd w:color="ffffff"/>
+        <w:shd w:val="clear" w:color="ffffff"/>
         <w:tcBorders>
-          <w:top w:val="none"/>
-          <w:left w:val="none"/>
-          <w:bottom w:val="none"/>
+          <w:top w:val="none" w:color="000000" w:sz="4" w:space="0"/>
+          <w:left w:val="none" w:color="000000" w:sz="4" w:space="0"/>
+          <w:bottom w:val="none" w:color="000000" w:sz="4" w:space="0"/>
           <w:right w:val="single" w:color="000000" w:themeColor="accent3" w:themeTint="FE" w:sz="4" w:space="0"/>
         </w:tcBorders>
       </w:tcPr>
@@ -12521,10 +13006,10 @@
       <w:tcPr>
         <w:shd w:val="clear" w:color="ffffff" w:themeColor="light1" w:fill="ffffff" w:themeFill="light1"/>
         <w:tcBorders>
-          <w:top w:val="none"/>
-          <w:left w:val="none"/>
+          <w:top w:val="none" w:color="000000" w:sz="4" w:space="0"/>
+          <w:left w:val="none" w:color="000000" w:sz="4" w:space="0"/>
           <w:bottom w:val="single" w:color="000000" w:themeColor="accent3" w:themeTint="FE" w:sz="4" w:space="0"/>
-          <w:right w:val="none"/>
+          <w:right w:val="none" w:color="000000" w:sz="4" w:space="0"/>
         </w:tcBorders>
       </w:tcPr>
     </w:tblStylePr>
@@ -12544,12 +13029,12 @@
         <w:tblBorders/>
       </w:tblPr>
       <w:tcPr>
-        <w:shd w:color="ffffff"/>
+        <w:shd w:val="clear" w:color="ffffff"/>
         <w:tcBorders>
-          <w:top w:val="none"/>
+          <w:top w:val="none" w:color="000000" w:sz="4" w:space="0"/>
           <w:left w:val="single" w:color="000000" w:themeColor="accent3" w:themeTint="FE" w:sz="4" w:space="0"/>
-          <w:bottom w:val="none"/>
-          <w:right w:val="none"/>
+          <w:bottom w:val="none" w:color="000000" w:sz="4" w:space="0"/>
+          <w:right w:val="none" w:color="000000" w:sz="4" w:space="0"/>
         </w:tcBorders>
       </w:tcPr>
     </w:tblStylePr>
@@ -12572,9 +13057,9 @@
         <w:shd w:val="clear" w:color="ffffff" w:themeColor="light1" w:fill="ffffff" w:themeFill="light1"/>
         <w:tcBorders>
           <w:top w:val="single" w:color="000000" w:themeColor="accent3" w:themeTint="FE" w:sz="4" w:space="0"/>
-          <w:left w:val="none"/>
-          <w:bottom w:val="none"/>
-          <w:right w:val="none"/>
+          <w:left w:val="none" w:color="000000" w:sz="4" w:space="0"/>
+          <w:bottom w:val="none" w:color="000000" w:sz="4" w:space="0"/>
+          <w:right w:val="none" w:color="000000" w:sz="4" w:space="0"/>
         </w:tcBorders>
       </w:tcPr>
     </w:tblStylePr>
@@ -12644,9 +13129,9 @@
       </w:tcPr>
     </w:tblStylePr>
   </w:style>
-  <w:style w:type="table" w:styleId="65">
+  <w:style w:type="table" w:styleId="754">
     <w:name w:val="Grid Table 7 Colorful - Accent 4"/>
-    <w:basedOn w:val="665"/>
+    <w:basedOn w:val="887"/>
     <w:uiPriority w:val="99"/>
     <w:pPr>
       <w:pBdr/>
@@ -12748,11 +13233,11 @@
         <w:tblBorders/>
       </w:tblPr>
       <w:tcPr>
-        <w:shd w:color="ffffff"/>
+        <w:shd w:val="clear" w:color="ffffff"/>
         <w:tcBorders>
-          <w:top w:val="none"/>
-          <w:left w:val="none"/>
-          <w:bottom w:val="none"/>
+          <w:top w:val="none" w:color="000000" w:sz="4" w:space="0"/>
+          <w:left w:val="none" w:color="000000" w:sz="4" w:space="0"/>
+          <w:bottom w:val="none" w:color="000000" w:sz="4" w:space="0"/>
           <w:right w:val="single" w:color="000000" w:themeColor="accent4" w:themeTint="9A" w:sz="4" w:space="0"/>
         </w:tcBorders>
       </w:tcPr>
@@ -12775,10 +13260,10 @@
       <w:tcPr>
         <w:shd w:val="clear" w:color="ffffff" w:themeColor="light1" w:fill="ffffff" w:themeFill="light1"/>
         <w:tcBorders>
-          <w:top w:val="none"/>
-          <w:left w:val="none"/>
+          <w:top w:val="none" w:color="000000" w:sz="4" w:space="0"/>
+          <w:left w:val="none" w:color="000000" w:sz="4" w:space="0"/>
           <w:bottom w:val="single" w:color="000000" w:themeColor="accent4" w:themeTint="9A" w:sz="4" w:space="0"/>
-          <w:right w:val="none"/>
+          <w:right w:val="none" w:color="000000" w:sz="4" w:space="0"/>
         </w:tcBorders>
       </w:tcPr>
     </w:tblStylePr>
@@ -12798,12 +13283,12 @@
         <w:tblBorders/>
       </w:tblPr>
       <w:tcPr>
-        <w:shd w:color="ffffff"/>
+        <w:shd w:val="clear" w:color="ffffff"/>
         <w:tcBorders>
-          <w:top w:val="none"/>
+          <w:top w:val="none" w:color="000000" w:sz="4" w:space="0"/>
           <w:left w:val="single" w:color="000000" w:themeColor="accent4" w:themeTint="9A" w:sz="4" w:space="0"/>
-          <w:bottom w:val="none"/>
-          <w:right w:val="none"/>
+          <w:bottom w:val="none" w:color="000000" w:sz="4" w:space="0"/>
+          <w:right w:val="none" w:color="000000" w:sz="4" w:space="0"/>
         </w:tcBorders>
       </w:tcPr>
     </w:tblStylePr>
@@ -12826,9 +13311,9 @@
         <w:shd w:val="clear" w:color="ffffff" w:themeColor="light1" w:fill="ffffff" w:themeFill="light1"/>
         <w:tcBorders>
           <w:top w:val="single" w:color="000000" w:themeColor="accent4" w:themeTint="9A" w:sz="4" w:space="0"/>
-          <w:left w:val="none"/>
-          <w:bottom w:val="none"/>
-          <w:right w:val="none"/>
+          <w:left w:val="none" w:color="000000" w:sz="4" w:space="0"/>
+          <w:bottom w:val="none" w:color="000000" w:sz="4" w:space="0"/>
+          <w:right w:val="none" w:color="000000" w:sz="4" w:space="0"/>
         </w:tcBorders>
       </w:tcPr>
     </w:tblStylePr>
@@ -12898,9 +13383,9 @@
       </w:tcPr>
     </w:tblStylePr>
   </w:style>
-  <w:style w:type="table" w:styleId="66">
+  <w:style w:type="table" w:styleId="755">
     <w:name w:val="Grid Table 7 Colorful - Accent 5"/>
-    <w:basedOn w:val="665"/>
+    <w:basedOn w:val="887"/>
     <w:uiPriority w:val="99"/>
     <w:pPr>
       <w:pBdr/>
@@ -13002,11 +13487,11 @@
         <w:tblBorders/>
       </w:tblPr>
       <w:tcPr>
-        <w:shd w:color="ffffff"/>
+        <w:shd w:val="clear" w:color="ffffff"/>
         <w:tcBorders>
-          <w:top w:val="none"/>
-          <w:left w:val="none"/>
-          <w:bottom w:val="none"/>
+          <w:top w:val="none" w:color="000000" w:sz="4" w:space="0"/>
+          <w:left w:val="none" w:color="000000" w:sz="4" w:space="0"/>
+          <w:bottom w:val="none" w:color="000000" w:sz="4" w:space="0"/>
           <w:right w:val="single" w:color="000000" w:themeColor="accent5" w:themeTint="90" w:sz="4" w:space="0"/>
         </w:tcBorders>
       </w:tcPr>
@@ -13029,10 +13514,10 @@
       <w:tcPr>
         <w:shd w:val="clear" w:color="ffffff" w:themeColor="light1" w:fill="ffffff" w:themeFill="light1"/>
         <w:tcBorders>
-          <w:top w:val="none"/>
-          <w:left w:val="none"/>
+          <w:top w:val="none" w:color="000000" w:sz="4" w:space="0"/>
+          <w:left w:val="none" w:color="000000" w:sz="4" w:space="0"/>
           <w:bottom w:val="single" w:color="000000" w:themeColor="accent5" w:themeTint="90" w:sz="4" w:space="0"/>
-          <w:right w:val="none"/>
+          <w:right w:val="none" w:color="000000" w:sz="4" w:space="0"/>
         </w:tcBorders>
       </w:tcPr>
     </w:tblStylePr>
@@ -13052,12 +13537,12 @@
         <w:tblBorders/>
       </w:tblPr>
       <w:tcPr>
-        <w:shd w:color="ffffff"/>
+        <w:shd w:val="clear" w:color="ffffff"/>
         <w:tcBorders>
-          <w:top w:val="none"/>
+          <w:top w:val="none" w:color="000000" w:sz="4" w:space="0"/>
           <w:left w:val="single" w:color="000000" w:themeColor="accent5" w:themeTint="90" w:sz="4" w:space="0"/>
-          <w:bottom w:val="none"/>
-          <w:right w:val="none"/>
+          <w:bottom w:val="none" w:color="000000" w:sz="4" w:space="0"/>
+          <w:right w:val="none" w:color="000000" w:sz="4" w:space="0"/>
         </w:tcBorders>
       </w:tcPr>
     </w:tblStylePr>
@@ -13080,9 +13565,9 @@
         <w:shd w:val="clear" w:color="ffffff" w:themeColor="light1" w:fill="ffffff" w:themeFill="light1"/>
         <w:tcBorders>
           <w:top w:val="single" w:color="000000" w:themeColor="accent5" w:themeTint="90" w:sz="4" w:space="0"/>
-          <w:left w:val="none"/>
-          <w:bottom w:val="none"/>
-          <w:right w:val="none"/>
+          <w:left w:val="none" w:color="000000" w:sz="4" w:space="0"/>
+          <w:bottom w:val="none" w:color="000000" w:sz="4" w:space="0"/>
+          <w:right w:val="none" w:color="000000" w:sz="4" w:space="0"/>
         </w:tcBorders>
       </w:tcPr>
     </w:tblStylePr>
@@ -13152,9 +13637,9 @@
       </w:tcPr>
     </w:tblStylePr>
   </w:style>
-  <w:style w:type="table" w:styleId="67">
+  <w:style w:type="table" w:styleId="756">
     <w:name w:val="Grid Table 7 Colorful - Accent 6"/>
-    <w:basedOn w:val="665"/>
+    <w:basedOn w:val="887"/>
     <w:uiPriority w:val="99"/>
     <w:pPr>
       <w:pBdr/>
@@ -13256,11 +13741,11 @@
         <w:tblBorders/>
       </w:tblPr>
       <w:tcPr>
-        <w:shd w:color="ffffff"/>
+        <w:shd w:val="clear" w:color="ffffff"/>
         <w:tcBorders>
-          <w:top w:val="none"/>
-          <w:left w:val="none"/>
-          <w:bottom w:val="none"/>
+          <w:top w:val="none" w:color="000000" w:sz="4" w:space="0"/>
+          <w:left w:val="none" w:color="000000" w:sz="4" w:space="0"/>
+          <w:bottom w:val="none" w:color="000000" w:sz="4" w:space="0"/>
           <w:right w:val="single" w:color="000000" w:themeColor="accent6" w:themeTint="90" w:sz="4" w:space="0"/>
         </w:tcBorders>
       </w:tcPr>
@@ -13283,10 +13768,10 @@
       <w:tcPr>
         <w:shd w:val="clear" w:color="ffffff" w:themeColor="light1" w:fill="ffffff" w:themeFill="light1"/>
         <w:tcBorders>
-          <w:top w:val="none"/>
-          <w:left w:val="none"/>
+          <w:top w:val="none" w:color="000000" w:sz="4" w:space="0"/>
+          <w:left w:val="none" w:color="000000" w:sz="4" w:space="0"/>
           <w:bottom w:val="single" w:color="000000" w:themeColor="accent6" w:themeTint="90" w:sz="4" w:space="0"/>
-          <w:right w:val="none"/>
+          <w:right w:val="none" w:color="000000" w:sz="4" w:space="0"/>
         </w:tcBorders>
       </w:tcPr>
     </w:tblStylePr>
@@ -13306,12 +13791,12 @@
         <w:tblBorders/>
       </w:tblPr>
       <w:tcPr>
-        <w:shd w:color="ffffff"/>
+        <w:shd w:val="clear" w:color="ffffff"/>
         <w:tcBorders>
-          <w:top w:val="none"/>
+          <w:top w:val="none" w:color="000000" w:sz="4" w:space="0"/>
           <w:left w:val="single" w:color="000000" w:themeColor="accent6" w:themeTint="90" w:sz="4" w:space="0"/>
-          <w:bottom w:val="none"/>
-          <w:right w:val="none"/>
+          <w:bottom w:val="none" w:color="000000" w:sz="4" w:space="0"/>
+          <w:right w:val="none" w:color="000000" w:sz="4" w:space="0"/>
         </w:tcBorders>
       </w:tcPr>
     </w:tblStylePr>
@@ -13334,9 +13819,9 @@
         <w:shd w:val="clear" w:color="ffffff" w:themeColor="light1" w:fill="ffffff" w:themeFill="light1"/>
         <w:tcBorders>
           <w:top w:val="single" w:color="000000" w:themeColor="accent6" w:themeTint="90" w:sz="4" w:space="0"/>
-          <w:left w:val="none"/>
-          <w:bottom w:val="none"/>
-          <w:right w:val="none"/>
+          <w:left w:val="none" w:color="000000" w:sz="4" w:space="0"/>
+          <w:bottom w:val="none" w:color="000000" w:sz="4" w:space="0"/>
+          <w:right w:val="none" w:color="000000" w:sz="4" w:space="0"/>
         </w:tcBorders>
       </w:tcPr>
     </w:tblStylePr>
@@ -13406,9 +13891,9 @@
       </w:tcPr>
     </w:tblStylePr>
   </w:style>
-  <w:style w:type="table" w:styleId="68">
+  <w:style w:type="table" w:styleId="757">
     <w:name w:val="List Table 1 Light"/>
-    <w:basedOn w:val="665"/>
+    <w:basedOn w:val="887"/>
     <w:uiPriority w:val="99"/>
     <w:pPr>
       <w:pBdr/>
@@ -13622,9 +14107,9 @@
       </w:tcPr>
     </w:tblStylePr>
   </w:style>
-  <w:style w:type="table" w:styleId="69">
+  <w:style w:type="table" w:styleId="758">
     <w:name w:val="List Table 1 Light - Accent 1"/>
-    <w:basedOn w:val="665"/>
+    <w:basedOn w:val="887"/>
     <w:uiPriority w:val="99"/>
     <w:pPr>
       <w:pBdr/>
@@ -13838,9 +14323,9 @@
       </w:tcPr>
     </w:tblStylePr>
   </w:style>
-  <w:style w:type="table" w:styleId="70">
+  <w:style w:type="table" w:styleId="759">
     <w:name w:val="List Table 1 Light - Accent 2"/>
-    <w:basedOn w:val="665"/>
+    <w:basedOn w:val="887"/>
     <w:uiPriority w:val="99"/>
     <w:pPr>
       <w:pBdr/>
@@ -14054,9 +14539,9 @@
       </w:tcPr>
     </w:tblStylePr>
   </w:style>
-  <w:style w:type="table" w:styleId="71">
+  <w:style w:type="table" w:styleId="760">
     <w:name w:val="List Table 1 Light - Accent 3"/>
-    <w:basedOn w:val="665"/>
+    <w:basedOn w:val="887"/>
     <w:uiPriority w:val="99"/>
     <w:pPr>
       <w:pBdr/>
@@ -14270,9 +14755,9 @@
       </w:tcPr>
     </w:tblStylePr>
   </w:style>
-  <w:style w:type="table" w:styleId="72">
+  <w:style w:type="table" w:styleId="761">
     <w:name w:val="List Table 1 Light - Accent 4"/>
-    <w:basedOn w:val="665"/>
+    <w:basedOn w:val="887"/>
     <w:uiPriority w:val="99"/>
     <w:pPr>
       <w:pBdr/>
@@ -14486,9 +14971,9 @@
       </w:tcPr>
     </w:tblStylePr>
   </w:style>
-  <w:style w:type="table" w:styleId="73">
+  <w:style w:type="table" w:styleId="762">
     <w:name w:val="List Table 1 Light - Accent 5"/>
-    <w:basedOn w:val="665"/>
+    <w:basedOn w:val="887"/>
     <w:uiPriority w:val="99"/>
     <w:pPr>
       <w:pBdr/>
@@ -14702,9 +15187,9 @@
       </w:tcPr>
     </w:tblStylePr>
   </w:style>
-  <w:style w:type="table" w:styleId="74">
+  <w:style w:type="table" w:styleId="763">
     <w:name w:val="List Table 1 Light - Accent 6"/>
-    <w:basedOn w:val="665"/>
+    <w:basedOn w:val="887"/>
     <w:uiPriority w:val="99"/>
     <w:pPr>
       <w:pBdr/>
@@ -14918,9 +15403,9 @@
       </w:tcPr>
     </w:tblStylePr>
   </w:style>
-  <w:style w:type="table" w:styleId="75">
+  <w:style w:type="table" w:styleId="764">
     <w:name w:val="List Table 2"/>
-    <w:basedOn w:val="665"/>
+    <w:basedOn w:val="887"/>
     <w:uiPriority w:val="99"/>
     <w:pPr>
       <w:pBdr/>
@@ -15156,9 +15641,9 @@
       </w:tcPr>
     </w:tblStylePr>
   </w:style>
-  <w:style w:type="table" w:styleId="76">
+  <w:style w:type="table" w:styleId="765">
     <w:name w:val="List Table 2 - Accent 1"/>
-    <w:basedOn w:val="665"/>
+    <w:basedOn w:val="887"/>
     <w:uiPriority w:val="99"/>
     <w:pPr>
       <w:pBdr/>
@@ -15394,9 +15879,9 @@
       </w:tcPr>
     </w:tblStylePr>
   </w:style>
-  <w:style w:type="table" w:styleId="77">
+  <w:style w:type="table" w:styleId="766">
     <w:name w:val="List Table 2 - Accent 2"/>
-    <w:basedOn w:val="665"/>
+    <w:basedOn w:val="887"/>
     <w:uiPriority w:val="99"/>
     <w:pPr>
       <w:pBdr/>
@@ -15632,9 +16117,9 @@
       </w:tcPr>
     </w:tblStylePr>
   </w:style>
-  <w:style w:type="table" w:styleId="78">
+  <w:style w:type="table" w:styleId="767">
     <w:name w:val="List Table 2 - Accent 3"/>
-    <w:basedOn w:val="665"/>
+    <w:basedOn w:val="887"/>
     <w:uiPriority w:val="99"/>
     <w:pPr>
       <w:pBdr/>
@@ -15870,9 +16355,9 @@
       </w:tcPr>
     </w:tblStylePr>
   </w:style>
-  <w:style w:type="table" w:styleId="79">
+  <w:style w:type="table" w:styleId="768">
     <w:name w:val="List Table 2 - Accent 4"/>
-    <w:basedOn w:val="665"/>
+    <w:basedOn w:val="887"/>
     <w:uiPriority w:val="99"/>
     <w:pPr>
       <w:pBdr/>
@@ -16108,9 +16593,9 @@
       </w:tcPr>
     </w:tblStylePr>
   </w:style>
-  <w:style w:type="table" w:styleId="80">
+  <w:style w:type="table" w:styleId="769">
     <w:name w:val="List Table 2 - Accent 5"/>
-    <w:basedOn w:val="665"/>
+    <w:basedOn w:val="887"/>
     <w:uiPriority w:val="99"/>
     <w:pPr>
       <w:pBdr/>
@@ -16346,9 +16831,9 @@
       </w:tcPr>
     </w:tblStylePr>
   </w:style>
-  <w:style w:type="table" w:styleId="81">
+  <w:style w:type="table" w:styleId="770">
     <w:name w:val="List Table 2 - Accent 6"/>
-    <w:basedOn w:val="665"/>
+    <w:basedOn w:val="887"/>
     <w:uiPriority w:val="99"/>
     <w:pPr>
       <w:pBdr/>
@@ -16584,9 +17069,9 @@
       </w:tcPr>
     </w:tblStylePr>
   </w:style>
-  <w:style w:type="table" w:styleId="82">
+  <w:style w:type="table" w:styleId="771">
     <w:name w:val="List Table 3"/>
-    <w:basedOn w:val="665"/>
+    <w:basedOn w:val="887"/>
     <w:uiPriority w:val="99"/>
     <w:pPr>
       <w:pBdr/>
@@ -16812,9 +17297,9 @@
       </w:tcPr>
     </w:tblStylePr>
   </w:style>
-  <w:style w:type="table" w:styleId="83">
+  <w:style w:type="table" w:styleId="772">
     <w:name w:val="List Table 3 - Accent 1"/>
-    <w:basedOn w:val="665"/>
+    <w:basedOn w:val="887"/>
     <w:uiPriority w:val="99"/>
     <w:pPr>
       <w:pBdr/>
@@ -17040,9 +17525,9 @@
       </w:tcPr>
     </w:tblStylePr>
   </w:style>
-  <w:style w:type="table" w:styleId="84">
+  <w:style w:type="table" w:styleId="773">
     <w:name w:val="List Table 3 - Accent 2"/>
-    <w:basedOn w:val="665"/>
+    <w:basedOn w:val="887"/>
     <w:uiPriority w:val="99"/>
     <w:pPr>
       <w:pBdr/>
@@ -17268,9 +17753,9 @@
       </w:tcPr>
     </w:tblStylePr>
   </w:style>
-  <w:style w:type="table" w:styleId="85">
+  <w:style w:type="table" w:styleId="774">
     <w:name w:val="List Table 3 - Accent 3"/>
-    <w:basedOn w:val="665"/>
+    <w:basedOn w:val="887"/>
     <w:uiPriority w:val="99"/>
     <w:pPr>
       <w:pBdr/>
@@ -17496,9 +17981,9 @@
       </w:tcPr>
     </w:tblStylePr>
   </w:style>
-  <w:style w:type="table" w:styleId="86">
+  <w:style w:type="table" w:styleId="775">
     <w:name w:val="List Table 3 - Accent 4"/>
-    <w:basedOn w:val="665"/>
+    <w:basedOn w:val="887"/>
     <w:uiPriority w:val="99"/>
     <w:pPr>
       <w:pBdr/>
@@ -17724,9 +18209,9 @@
       </w:tcPr>
     </w:tblStylePr>
   </w:style>
-  <w:style w:type="table" w:styleId="87">
+  <w:style w:type="table" w:styleId="776">
     <w:name w:val="List Table 3 - Accent 5"/>
-    <w:basedOn w:val="665"/>
+    <w:basedOn w:val="887"/>
     <w:uiPriority w:val="99"/>
     <w:pPr>
       <w:pBdr/>
@@ -17952,9 +18437,9 @@
       </w:tcPr>
     </w:tblStylePr>
   </w:style>
-  <w:style w:type="table" w:styleId="88">
+  <w:style w:type="table" w:styleId="777">
     <w:name w:val="List Table 3 - Accent 6"/>
-    <w:basedOn w:val="665"/>
+    <w:basedOn w:val="887"/>
     <w:uiPriority w:val="99"/>
     <w:pPr>
       <w:pBdr/>
@@ -18180,9 +18665,9 @@
       </w:tcPr>
     </w:tblStylePr>
   </w:style>
-  <w:style w:type="table" w:styleId="89">
+  <w:style w:type="table" w:styleId="778">
     <w:name w:val="List Table 4"/>
-    <w:basedOn w:val="665"/>
+    <w:basedOn w:val="887"/>
     <w:uiPriority w:val="99"/>
     <w:pPr>
       <w:pBdr/>
@@ -18405,9 +18890,9 @@
       </w:tcPr>
     </w:tblStylePr>
   </w:style>
-  <w:style w:type="table" w:styleId="90">
+  <w:style w:type="table" w:styleId="779">
     <w:name w:val="List Table 4 - Accent 1"/>
-    <w:basedOn w:val="665"/>
+    <w:basedOn w:val="887"/>
     <w:uiPriority w:val="99"/>
     <w:pPr>
       <w:pBdr/>
@@ -18630,9 +19115,9 @@
       </w:tcPr>
     </w:tblStylePr>
   </w:style>
-  <w:style w:type="table" w:styleId="91">
+  <w:style w:type="table" w:styleId="780">
     <w:name w:val="List Table 4 - Accent 2"/>
-    <w:basedOn w:val="665"/>
+    <w:basedOn w:val="887"/>
     <w:uiPriority w:val="99"/>
     <w:pPr>
       <w:pBdr/>
@@ -18855,9 +19340,9 @@
       </w:tcPr>
     </w:tblStylePr>
   </w:style>
-  <w:style w:type="table" w:styleId="92">
+  <w:style w:type="table" w:styleId="781">
     <w:name w:val="List Table 4 - Accent 3"/>
-    <w:basedOn w:val="665"/>
+    <w:basedOn w:val="887"/>
     <w:uiPriority w:val="99"/>
     <w:pPr>
       <w:pBdr/>
@@ -19080,9 +19565,9 @@
       </w:tcPr>
     </w:tblStylePr>
   </w:style>
-  <w:style w:type="table" w:styleId="93">
+  <w:style w:type="table" w:styleId="782">
     <w:name w:val="List Table 4 - Accent 4"/>
-    <w:basedOn w:val="665"/>
+    <w:basedOn w:val="887"/>
     <w:uiPriority w:val="99"/>
     <w:pPr>
       <w:pBdr/>
@@ -19305,9 +19790,9 @@
       </w:tcPr>
     </w:tblStylePr>
   </w:style>
-  <w:style w:type="table" w:styleId="94">
+  <w:style w:type="table" w:styleId="783">
     <w:name w:val="List Table 4 - Accent 5"/>
-    <w:basedOn w:val="665"/>
+    <w:basedOn w:val="887"/>
     <w:uiPriority w:val="99"/>
     <w:pPr>
       <w:pBdr/>
@@ -19530,9 +20015,9 @@
       </w:tcPr>
     </w:tblStylePr>
   </w:style>
-  <w:style w:type="table" w:styleId="95">
+  <w:style w:type="table" w:styleId="784">
     <w:name w:val="List Table 4 - Accent 6"/>
-    <w:basedOn w:val="665"/>
+    <w:basedOn w:val="887"/>
     <w:uiPriority w:val="99"/>
     <w:pPr>
       <w:pBdr/>
@@ -19755,9 +20240,9 @@
       </w:tcPr>
     </w:tblStylePr>
   </w:style>
-  <w:style w:type="table" w:styleId="96">
+  <w:style w:type="table" w:styleId="785">
     <w:name w:val="List Table 5 Dark"/>
-    <w:basedOn w:val="665"/>
+    <w:basedOn w:val="887"/>
     <w:uiPriority w:val="99"/>
     <w:pPr>
       <w:pBdr/>
@@ -19997,9 +20482,9 @@
       </w:tcPr>
     </w:tblStylePr>
   </w:style>
-  <w:style w:type="table" w:styleId="97">
+  <w:style w:type="table" w:styleId="786">
     <w:name w:val="List Table 5 Dark - Accent 1"/>
-    <w:basedOn w:val="665"/>
+    <w:basedOn w:val="887"/>
     <w:uiPriority w:val="99"/>
     <w:pPr>
       <w:pBdr/>
@@ -20239,9 +20724,9 @@
       </w:tcPr>
     </w:tblStylePr>
   </w:style>
-  <w:style w:type="table" w:styleId="98">
+  <w:style w:type="table" w:styleId="787">
     <w:name w:val="List Table 5 Dark - Accent 2"/>
-    <w:basedOn w:val="665"/>
+    <w:basedOn w:val="887"/>
     <w:uiPriority w:val="99"/>
     <w:pPr>
       <w:pBdr/>
@@ -20481,9 +20966,9 @@
       </w:tcPr>
     </w:tblStylePr>
   </w:style>
-  <w:style w:type="table" w:styleId="99">
+  <w:style w:type="table" w:styleId="788">
     <w:name w:val="List Table 5 Dark - Accent 3"/>
-    <w:basedOn w:val="665"/>
+    <w:basedOn w:val="887"/>
     <w:uiPriority w:val="99"/>
     <w:pPr>
       <w:pBdr/>
@@ -20723,9 +21208,9 @@
       </w:tcPr>
     </w:tblStylePr>
   </w:style>
-  <w:style w:type="table" w:styleId="100">
+  <w:style w:type="table" w:styleId="789">
     <w:name w:val="List Table 5 Dark - Accent 4"/>
-    <w:basedOn w:val="665"/>
+    <w:basedOn w:val="887"/>
     <w:uiPriority w:val="99"/>
     <w:pPr>
       <w:pBdr/>
@@ -20965,9 +21450,9 @@
       </w:tcPr>
     </w:tblStylePr>
   </w:style>
-  <w:style w:type="table" w:styleId="101">
+  <w:style w:type="table" w:styleId="790">
     <w:name w:val="List Table 5 Dark - Accent 5"/>
-    <w:basedOn w:val="665"/>
+    <w:basedOn w:val="887"/>
     <w:uiPriority w:val="99"/>
     <w:pPr>
       <w:pBdr/>
@@ -21207,9 +21692,9 @@
       </w:tcPr>
     </w:tblStylePr>
   </w:style>
-  <w:style w:type="table" w:styleId="102">
+  <w:style w:type="table" w:styleId="791">
     <w:name w:val="List Table 5 Dark - Accent 6"/>
-    <w:basedOn w:val="665"/>
+    <w:basedOn w:val="887"/>
     <w:uiPriority w:val="99"/>
     <w:pPr>
       <w:pBdr/>
@@ -21449,9 +21934,9 @@
       </w:tcPr>
     </w:tblStylePr>
   </w:style>
-  <w:style w:type="table" w:styleId="103">
+  <w:style w:type="table" w:styleId="792">
     <w:name w:val="List Table 6 Colorful"/>
-    <w:basedOn w:val="665"/>
+    <w:basedOn w:val="887"/>
     <w:uiPriority w:val="99"/>
     <w:pPr>
       <w:pBdr/>
@@ -21672,9 +22157,9 @@
       </w:tcPr>
     </w:tblStylePr>
   </w:style>
-  <w:style w:type="table" w:styleId="104">
+  <w:style w:type="table" w:styleId="793">
     <w:name w:val="List Table 6 Colorful - Accent 1"/>
-    <w:basedOn w:val="665"/>
+    <w:basedOn w:val="887"/>
     <w:uiPriority w:val="99"/>
     <w:pPr>
       <w:pBdr/>
@@ -21895,9 +22380,9 @@
       </w:tcPr>
     </w:tblStylePr>
   </w:style>
-  <w:style w:type="table" w:styleId="105">
+  <w:style w:type="table" w:styleId="794">
     <w:name w:val="List Table 6 Colorful - Accent 2"/>
-    <w:basedOn w:val="665"/>
+    <w:basedOn w:val="887"/>
     <w:uiPriority w:val="99"/>
     <w:pPr>
       <w:pBdr/>
@@ -22118,9 +22603,9 @@
       </w:tcPr>
     </w:tblStylePr>
   </w:style>
-  <w:style w:type="table" w:styleId="106">
+  <w:style w:type="table" w:styleId="795">
     <w:name w:val="List Table 6 Colorful - Accent 3"/>
-    <w:basedOn w:val="665"/>
+    <w:basedOn w:val="887"/>
     <w:uiPriority w:val="99"/>
     <w:pPr>
       <w:pBdr/>
@@ -22341,9 +22826,9 @@
       </w:tcPr>
     </w:tblStylePr>
   </w:style>
-  <w:style w:type="table" w:styleId="107">
+  <w:style w:type="table" w:styleId="796">
     <w:name w:val="List Table 6 Colorful - Accent 4"/>
-    <w:basedOn w:val="665"/>
+    <w:basedOn w:val="887"/>
     <w:uiPriority w:val="99"/>
     <w:pPr>
       <w:pBdr/>
@@ -22564,9 +23049,9 @@
       </w:tcPr>
     </w:tblStylePr>
   </w:style>
-  <w:style w:type="table" w:styleId="108">
+  <w:style w:type="table" w:styleId="797">
     <w:name w:val="List Table 6 Colorful - Accent 5"/>
-    <w:basedOn w:val="665"/>
+    <w:basedOn w:val="887"/>
     <w:uiPriority w:val="99"/>
     <w:pPr>
       <w:pBdr/>
@@ -22787,9 +23272,9 @@
       </w:tcPr>
     </w:tblStylePr>
   </w:style>
-  <w:style w:type="table" w:styleId="109">
+  <w:style w:type="table" w:styleId="798">
     <w:name w:val="List Table 6 Colorful - Accent 6"/>
-    <w:basedOn w:val="665"/>
+    <w:basedOn w:val="887"/>
     <w:uiPriority w:val="99"/>
     <w:pPr>
       <w:pBdr/>
@@ -23010,9 +23495,9 @@
       </w:tcPr>
     </w:tblStylePr>
   </w:style>
-  <w:style w:type="table" w:styleId="110">
+  <w:style w:type="table" w:styleId="799">
     <w:name w:val="List Table 7 Colorful"/>
-    <w:basedOn w:val="665"/>
+    <w:basedOn w:val="887"/>
     <w:uiPriority w:val="99"/>
     <w:pPr>
       <w:pBdr/>
@@ -23111,11 +23596,11 @@
         <w:tblBorders/>
       </w:tblPr>
       <w:tcPr>
-        <w:shd w:color="ffffff"/>
+        <w:shd w:val="clear" w:color="ffffff"/>
         <w:tcBorders>
-          <w:top w:val="none"/>
-          <w:left w:val="none"/>
-          <w:bottom w:val="none"/>
+          <w:top w:val="none" w:color="000000" w:sz="4" w:space="0"/>
+          <w:left w:val="none" w:color="000000" w:sz="4" w:space="0"/>
+          <w:bottom w:val="none" w:color="000000" w:sz="4" w:space="0"/>
           <w:right w:val="single" w:color="000000" w:themeColor="text1" w:themeTint="80" w:sz="4" w:space="0"/>
         </w:tcBorders>
       </w:tcPr>
@@ -23138,10 +23623,10 @@
       <w:tcPr>
         <w:shd w:val="clear" w:color="ffffff" w:themeColor="light1" w:fill="ffffff" w:themeFill="light1"/>
         <w:tcBorders>
-          <w:top w:val="none"/>
-          <w:left w:val="none"/>
+          <w:top w:val="none" w:color="000000" w:sz="4" w:space="0"/>
+          <w:left w:val="none" w:color="000000" w:sz="4" w:space="0"/>
           <w:bottom w:val="single" w:color="000000" w:themeColor="text1" w:themeTint="80" w:sz="4" w:space="0"/>
-          <w:right w:val="none"/>
+          <w:right w:val="none" w:color="000000" w:sz="4" w:space="0"/>
         </w:tcBorders>
       </w:tcPr>
     </w:tblStylePr>
@@ -23161,12 +23646,12 @@
         <w:tblBorders/>
       </w:tblPr>
       <w:tcPr>
-        <w:shd w:color="ffffff"/>
+        <w:shd w:val="clear" w:color="ffffff"/>
         <w:tcBorders>
-          <w:top w:val="none"/>
+          <w:top w:val="none" w:color="000000" w:sz="4" w:space="0"/>
           <w:left w:val="single" w:color="000000" w:themeColor="text1" w:themeTint="80" w:sz="4" w:space="0"/>
-          <w:bottom w:val="none"/>
-          <w:right w:val="none"/>
+          <w:bottom w:val="none" w:color="000000" w:sz="4" w:space="0"/>
+          <w:right w:val="none" w:color="000000" w:sz="4" w:space="0"/>
         </w:tcBorders>
       </w:tcPr>
     </w:tblStylePr>
@@ -23189,9 +23674,9 @@
         <w:shd w:val="clear" w:color="ffffff" w:themeColor="light1" w:fill="ffffff" w:themeFill="light1"/>
         <w:tcBorders>
           <w:top w:val="single" w:color="000000" w:themeColor="text1" w:themeTint="80" w:sz="4" w:space="0"/>
-          <w:left w:val="none"/>
-          <w:bottom w:val="none"/>
-          <w:right w:val="none"/>
+          <w:left w:val="none" w:color="000000" w:sz="4" w:space="0"/>
+          <w:bottom w:val="none" w:color="000000" w:sz="4" w:space="0"/>
+          <w:right w:val="none" w:color="000000" w:sz="4" w:space="0"/>
         </w:tcBorders>
       </w:tcPr>
     </w:tblStylePr>
@@ -23266,9 +23751,9 @@
       </w:tcPr>
     </w:tblStylePr>
   </w:style>
-  <w:style w:type="table" w:styleId="111">
+  <w:style w:type="table" w:styleId="800">
     <w:name w:val="List Table 7 Colorful - Accent 1"/>
-    <w:basedOn w:val="665"/>
+    <w:basedOn w:val="887"/>
     <w:uiPriority w:val="99"/>
     <w:pPr>
       <w:pBdr/>
@@ -23367,11 +23852,11 @@
         <w:tblBorders/>
       </w:tblPr>
       <w:tcPr>
-        <w:shd w:color="ffffff"/>
+        <w:shd w:val="clear" w:color="ffffff"/>
         <w:tcBorders>
-          <w:top w:val="none"/>
-          <w:left w:val="none"/>
-          <w:bottom w:val="none"/>
+          <w:top w:val="none" w:color="000000" w:sz="4" w:space="0"/>
+          <w:left w:val="none" w:color="000000" w:sz="4" w:space="0"/>
+          <w:bottom w:val="none" w:color="000000" w:sz="4" w:space="0"/>
           <w:right w:val="single" w:color="000000" w:themeColor="accent1" w:sz="4" w:space="0"/>
         </w:tcBorders>
       </w:tcPr>
@@ -23394,10 +23879,10 @@
       <w:tcPr>
         <w:shd w:val="clear" w:color="ffffff" w:themeColor="light1" w:fill="ffffff" w:themeFill="light1"/>
         <w:tcBorders>
-          <w:top w:val="none"/>
-          <w:left w:val="none"/>
+          <w:top w:val="none" w:color="000000" w:sz="4" w:space="0"/>
+          <w:left w:val="none" w:color="000000" w:sz="4" w:space="0"/>
           <w:bottom w:val="single" w:color="000000" w:themeColor="accent1" w:sz="4" w:space="0"/>
-          <w:right w:val="none"/>
+          <w:right w:val="none" w:color="000000" w:sz="4" w:space="0"/>
         </w:tcBorders>
       </w:tcPr>
     </w:tblStylePr>
@@ -23417,12 +23902,12 @@
         <w:tblBorders/>
       </w:tblPr>
       <w:tcPr>
-        <w:shd w:color="ffffff"/>
+        <w:shd w:val="clear" w:color="ffffff"/>
         <w:tcBorders>
-          <w:top w:val="none"/>
+          <w:top w:val="none" w:color="000000" w:sz="4" w:space="0"/>
           <w:left w:val="single" w:color="000000" w:themeColor="accent1" w:sz="4" w:space="0"/>
-          <w:bottom w:val="none"/>
-          <w:right w:val="none"/>
+          <w:bottom w:val="none" w:color="000000" w:sz="4" w:space="0"/>
+          <w:right w:val="none" w:color="000000" w:sz="4" w:space="0"/>
         </w:tcBorders>
       </w:tcPr>
     </w:tblStylePr>
@@ -23445,9 +23930,9 @@
         <w:shd w:val="clear" w:color="ffffff" w:themeColor="light1" w:fill="ffffff" w:themeFill="light1"/>
         <w:tcBorders>
           <w:top w:val="single" w:color="000000" w:themeColor="accent1" w:sz="4" w:space="0"/>
-          <w:left w:val="none"/>
-          <w:bottom w:val="none"/>
-          <w:right w:val="none"/>
+          <w:left w:val="none" w:color="000000" w:sz="4" w:space="0"/>
+          <w:bottom w:val="none" w:color="000000" w:sz="4" w:space="0"/>
+          <w:right w:val="none" w:color="000000" w:sz="4" w:space="0"/>
         </w:tcBorders>
       </w:tcPr>
     </w:tblStylePr>
@@ -23522,9 +24007,9 @@
       </w:tcPr>
     </w:tblStylePr>
   </w:style>
-  <w:style w:type="table" w:styleId="112">
+  <w:style w:type="table" w:styleId="801">
     <w:name w:val="List Table 7 Colorful - Accent 2"/>
-    <w:basedOn w:val="665"/>
+    <w:basedOn w:val="887"/>
     <w:uiPriority w:val="99"/>
     <w:pPr>
       <w:pBdr/>
@@ -23623,11 +24108,11 @@
         <w:tblBorders/>
       </w:tblPr>
       <w:tcPr>
-        <w:shd w:color="ffffff"/>
+        <w:shd w:val="clear" w:color="ffffff"/>
         <w:tcBorders>
-          <w:top w:val="none"/>
-          <w:left w:val="none"/>
-          <w:bottom w:val="none"/>
+          <w:top w:val="none" w:color="000000" w:sz="4" w:space="0"/>
+          <w:left w:val="none" w:color="000000" w:sz="4" w:space="0"/>
+          <w:bottom w:val="none" w:color="000000" w:sz="4" w:space="0"/>
           <w:right w:val="single" w:color="000000" w:themeColor="accent2" w:themeTint="97" w:sz="4" w:space="0"/>
         </w:tcBorders>
       </w:tcPr>
@@ -23650,10 +24135,10 @@
       <w:tcPr>
         <w:shd w:val="clear" w:color="ffffff" w:themeColor="light1" w:fill="ffffff" w:themeFill="light1"/>
         <w:tcBorders>
-          <w:top w:val="none"/>
-          <w:left w:val="none"/>
+          <w:top w:val="none" w:color="000000" w:sz="4" w:space="0"/>
+          <w:left w:val="none" w:color="000000" w:sz="4" w:space="0"/>
           <w:bottom w:val="single" w:color="000000" w:themeColor="accent2" w:themeTint="97" w:sz="4" w:space="0"/>
-          <w:right w:val="none"/>
+          <w:right w:val="none" w:color="000000" w:sz="4" w:space="0"/>
         </w:tcBorders>
       </w:tcPr>
     </w:tblStylePr>
@@ -23673,12 +24158,12 @@
         <w:tblBorders/>
       </w:tblPr>
       <w:tcPr>
-        <w:shd w:color="ffffff"/>
+        <w:shd w:val="clear" w:color="ffffff"/>
         <w:tcBorders>
-          <w:top w:val="none"/>
+          <w:top w:val="none" w:color="000000" w:sz="4" w:space="0"/>
           <w:left w:val="single" w:color="000000" w:themeColor="accent2" w:themeTint="97" w:sz="4" w:space="0"/>
-          <w:bottom w:val="none"/>
-          <w:right w:val="none"/>
+          <w:bottom w:val="none" w:color="000000" w:sz="4" w:space="0"/>
+          <w:right w:val="none" w:color="000000" w:sz="4" w:space="0"/>
         </w:tcBorders>
       </w:tcPr>
     </w:tblStylePr>
@@ -23701,9 +24186,9 @@
         <w:shd w:val="clear" w:color="ffffff" w:themeColor="light1" w:fill="ffffff" w:themeFill="light1"/>
         <w:tcBorders>
           <w:top w:val="single" w:color="000000" w:themeColor="accent2" w:themeTint="97" w:sz="4" w:space="0"/>
-          <w:left w:val="none"/>
-          <w:bottom w:val="none"/>
-          <w:right w:val="none"/>
+          <w:left w:val="none" w:color="000000" w:sz="4" w:space="0"/>
+          <w:bottom w:val="none" w:color="000000" w:sz="4" w:space="0"/>
+          <w:right w:val="none" w:color="000000" w:sz="4" w:space="0"/>
         </w:tcBorders>
       </w:tcPr>
     </w:tblStylePr>
@@ -23778,9 +24263,9 @@
       </w:tcPr>
     </w:tblStylePr>
   </w:style>
-  <w:style w:type="table" w:styleId="113">
+  <w:style w:type="table" w:styleId="802">
     <w:name w:val="List Table 7 Colorful - Accent 3"/>
-    <w:basedOn w:val="665"/>
+    <w:basedOn w:val="887"/>
     <w:uiPriority w:val="99"/>
     <w:pPr>
       <w:pBdr/>
@@ -23879,11 +24364,11 @@
         <w:tblBorders/>
       </w:tblPr>
       <w:tcPr>
-        <w:shd w:color="ffffff"/>
+        <w:shd w:val="clear" w:color="ffffff"/>
         <w:tcBorders>
-          <w:top w:val="none"/>
-          <w:left w:val="none"/>
-          <w:bottom w:val="none"/>
+          <w:top w:val="none" w:color="000000" w:sz="4" w:space="0"/>
+          <w:left w:val="none" w:color="000000" w:sz="4" w:space="0"/>
+          <w:bottom w:val="none" w:color="000000" w:sz="4" w:space="0"/>
           <w:right w:val="single" w:color="000000" w:themeColor="accent3" w:themeTint="98" w:sz="4" w:space="0"/>
         </w:tcBorders>
       </w:tcPr>
@@ -23906,10 +24391,10 @@
       <w:tcPr>
         <w:shd w:val="clear" w:color="ffffff" w:themeColor="light1" w:fill="ffffff" w:themeFill="light1"/>
         <w:tcBorders>
-          <w:top w:val="none"/>
-          <w:left w:val="none"/>
+          <w:top w:val="none" w:color="000000" w:sz="4" w:space="0"/>
+          <w:left w:val="none" w:color="000000" w:sz="4" w:space="0"/>
           <w:bottom w:val="single" w:color="000000" w:themeColor="accent3" w:themeTint="98" w:sz="4" w:space="0"/>
-          <w:right w:val="none"/>
+          <w:right w:val="none" w:color="000000" w:sz="4" w:space="0"/>
         </w:tcBorders>
       </w:tcPr>
     </w:tblStylePr>
@@ -23929,12 +24414,12 @@
         <w:tblBorders/>
       </w:tblPr>
       <w:tcPr>
-        <w:shd w:color="ffffff"/>
+        <w:shd w:val="clear" w:color="ffffff"/>
         <w:tcBorders>
-          <w:top w:val="none"/>
+          <w:top w:val="none" w:color="000000" w:sz="4" w:space="0"/>
           <w:left w:val="single" w:color="000000" w:themeColor="accent3" w:themeTint="98" w:sz="4" w:space="0"/>
-          <w:bottom w:val="none"/>
-          <w:right w:val="none"/>
+          <w:bottom w:val="none" w:color="000000" w:sz="4" w:space="0"/>
+          <w:right w:val="none" w:color="000000" w:sz="4" w:space="0"/>
         </w:tcBorders>
       </w:tcPr>
     </w:tblStylePr>
@@ -23957,9 +24442,9 @@
         <w:shd w:val="clear" w:color="ffffff" w:themeColor="light1" w:fill="ffffff" w:themeFill="light1"/>
         <w:tcBorders>
           <w:top w:val="single" w:color="000000" w:themeColor="accent3" w:themeTint="98" w:sz="4" w:space="0"/>
-          <w:left w:val="none"/>
-          <w:bottom w:val="none"/>
-          <w:right w:val="none"/>
+          <w:left w:val="none" w:color="000000" w:sz="4" w:space="0"/>
+          <w:bottom w:val="none" w:color="000000" w:sz="4" w:space="0"/>
+          <w:right w:val="none" w:color="000000" w:sz="4" w:space="0"/>
         </w:tcBorders>
       </w:tcPr>
     </w:tblStylePr>
@@ -24034,9 +24519,9 @@
       </w:tcPr>
     </w:tblStylePr>
   </w:style>
-  <w:style w:type="table" w:styleId="114">
+  <w:style w:type="table" w:styleId="803">
     <w:name w:val="List Table 7 Colorful - Accent 4"/>
-    <w:basedOn w:val="665"/>
+    <w:basedOn w:val="887"/>
     <w:uiPriority w:val="99"/>
     <w:pPr>
       <w:pBdr/>
@@ -24135,11 +24620,11 @@
         <w:tblBorders/>
       </w:tblPr>
       <w:tcPr>
-        <w:shd w:color="ffffff"/>
+        <w:shd w:val="clear" w:color="ffffff"/>
         <w:tcBorders>
-          <w:top w:val="none"/>
-          <w:left w:val="none"/>
-          <w:bottom w:val="none"/>
+          <w:top w:val="none" w:color="000000" w:sz="4" w:space="0"/>
+          <w:left w:val="none" w:color="000000" w:sz="4" w:space="0"/>
+          <w:bottom w:val="none" w:color="000000" w:sz="4" w:space="0"/>
           <w:right w:val="single" w:color="000000" w:themeColor="accent4" w:themeTint="9A" w:sz="4" w:space="0"/>
         </w:tcBorders>
       </w:tcPr>
@@ -24162,10 +24647,10 @@
       <w:tcPr>
         <w:shd w:val="clear" w:color="ffffff" w:themeColor="light1" w:fill="ffffff" w:themeFill="light1"/>
         <w:tcBorders>
-          <w:top w:val="none"/>
-          <w:left w:val="none"/>
+          <w:top w:val="none" w:color="000000" w:sz="4" w:space="0"/>
+          <w:left w:val="none" w:color="000000" w:sz="4" w:space="0"/>
           <w:bottom w:val="single" w:color="000000" w:themeColor="accent4" w:themeTint="9A" w:sz="4" w:space="0"/>
-          <w:right w:val="none"/>
+          <w:right w:val="none" w:color="000000" w:sz="4" w:space="0"/>
         </w:tcBorders>
       </w:tcPr>
     </w:tblStylePr>
@@ -24185,12 +24670,12 @@
         <w:tblBorders/>
       </w:tblPr>
       <w:tcPr>
-        <w:shd w:color="ffffff"/>
+        <w:shd w:val="clear" w:color="ffffff"/>
         <w:tcBorders>
-          <w:top w:val="none"/>
+          <w:top w:val="none" w:color="000000" w:sz="4" w:space="0"/>
           <w:left w:val="single" w:color="000000" w:themeColor="accent4" w:themeTint="9A" w:sz="4" w:space="0"/>
-          <w:bottom w:val="none"/>
-          <w:right w:val="none"/>
+          <w:bottom w:val="none" w:color="000000" w:sz="4" w:space="0"/>
+          <w:right w:val="none" w:color="000000" w:sz="4" w:space="0"/>
         </w:tcBorders>
       </w:tcPr>
     </w:tblStylePr>
@@ -24213,9 +24698,9 @@
         <w:shd w:val="clear" w:color="ffffff" w:themeColor="light1" w:fill="ffffff" w:themeFill="light1"/>
         <w:tcBorders>
           <w:top w:val="single" w:color="000000" w:themeColor="accent4" w:themeTint="9A" w:sz="4" w:space="0"/>
-          <w:left w:val="none"/>
-          <w:bottom w:val="none"/>
-          <w:right w:val="none"/>
+          <w:left w:val="none" w:color="000000" w:sz="4" w:space="0"/>
+          <w:bottom w:val="none" w:color="000000" w:sz="4" w:space="0"/>
+          <w:right w:val="none" w:color="000000" w:sz="4" w:space="0"/>
         </w:tcBorders>
       </w:tcPr>
     </w:tblStylePr>
@@ -24290,9 +24775,9 @@
       </w:tcPr>
     </w:tblStylePr>
   </w:style>
-  <w:style w:type="table" w:styleId="115">
+  <w:style w:type="table" w:styleId="804">
     <w:name w:val="List Table 7 Colorful - Accent 5"/>
-    <w:basedOn w:val="665"/>
+    <w:basedOn w:val="887"/>
     <w:uiPriority w:val="99"/>
     <w:pPr>
       <w:pBdr/>
@@ -24391,11 +24876,11 @@
         <w:tblBorders/>
       </w:tblPr>
       <w:tcPr>
-        <w:shd w:color="ffffff"/>
+        <w:shd w:val="clear" w:color="ffffff"/>
         <w:tcBorders>
-          <w:top w:val="none"/>
-          <w:left w:val="none"/>
-          <w:bottom w:val="none"/>
+          <w:top w:val="none" w:color="000000" w:sz="4" w:space="0"/>
+          <w:left w:val="none" w:color="000000" w:sz="4" w:space="0"/>
+          <w:bottom w:val="none" w:color="000000" w:sz="4" w:space="0"/>
           <w:right w:val="single" w:color="000000" w:themeColor="accent5" w:themeTint="9A" w:sz="4" w:space="0"/>
         </w:tcBorders>
       </w:tcPr>
@@ -24418,10 +24903,10 @@
       <w:tcPr>
         <w:shd w:val="clear" w:color="ffffff" w:themeColor="light1" w:fill="ffffff" w:themeFill="light1"/>
         <w:tcBorders>
-          <w:top w:val="none"/>
-          <w:left w:val="none"/>
+          <w:top w:val="none" w:color="000000" w:sz="4" w:space="0"/>
+          <w:left w:val="none" w:color="000000" w:sz="4" w:space="0"/>
           <w:bottom w:val="single" w:color="000000" w:themeColor="accent5" w:themeTint="9A" w:sz="4" w:space="0"/>
-          <w:right w:val="none"/>
+          <w:right w:val="none" w:color="000000" w:sz="4" w:space="0"/>
         </w:tcBorders>
       </w:tcPr>
     </w:tblStylePr>
@@ -24441,12 +24926,12 @@
         <w:tblBorders/>
       </w:tblPr>
       <w:tcPr>
-        <w:shd w:color="ffffff"/>
+        <w:shd w:val="clear" w:color="ffffff"/>
         <w:tcBorders>
-          <w:top w:val="none"/>
+          <w:top w:val="none" w:color="000000" w:sz="4" w:space="0"/>
           <w:left w:val="single" w:color="000000" w:themeColor="accent5" w:themeTint="9A" w:sz="4" w:space="0"/>
-          <w:bottom w:val="none"/>
-          <w:right w:val="none"/>
+          <w:bottom w:val="none" w:color="000000" w:sz="4" w:space="0"/>
+          <w:right w:val="none" w:color="000000" w:sz="4" w:space="0"/>
         </w:tcBorders>
       </w:tcPr>
     </w:tblStylePr>
@@ -24469,9 +24954,9 @@
         <w:shd w:val="clear" w:color="ffffff" w:themeColor="light1" w:fill="ffffff" w:themeFill="light1"/>
         <w:tcBorders>
           <w:top w:val="single" w:color="000000" w:themeColor="accent5" w:themeTint="9A" w:sz="4" w:space="0"/>
-          <w:left w:val="none"/>
-          <w:bottom w:val="none"/>
-          <w:right w:val="none"/>
+          <w:left w:val="none" w:color="000000" w:sz="4" w:space="0"/>
+          <w:bottom w:val="none" w:color="000000" w:sz="4" w:space="0"/>
+          <w:right w:val="none" w:color="000000" w:sz="4" w:space="0"/>
         </w:tcBorders>
       </w:tcPr>
     </w:tblStylePr>
@@ -24546,9 +25031,9 @@
       </w:tcPr>
     </w:tblStylePr>
   </w:style>
-  <w:style w:type="table" w:styleId="116">
+  <w:style w:type="table" w:styleId="805">
     <w:name w:val="List Table 7 Colorful - Accent 6"/>
-    <w:basedOn w:val="665"/>
+    <w:basedOn w:val="887"/>
     <w:uiPriority w:val="99"/>
     <w:pPr>
       <w:pBdr/>
@@ -24647,11 +25132,11 @@
         <w:tblBorders/>
       </w:tblPr>
       <w:tcPr>
-        <w:shd w:color="ffffff"/>
+        <w:shd w:val="clear" w:color="ffffff"/>
         <w:tcBorders>
-          <w:top w:val="none"/>
-          <w:left w:val="none"/>
-          <w:bottom w:val="none"/>
+          <w:top w:val="none" w:color="000000" w:sz="4" w:space="0"/>
+          <w:left w:val="none" w:color="000000" w:sz="4" w:space="0"/>
+          <w:bottom w:val="none" w:color="000000" w:sz="4" w:space="0"/>
           <w:right w:val="single" w:color="000000" w:themeColor="accent6" w:themeTint="98" w:sz="4" w:space="0"/>
         </w:tcBorders>
       </w:tcPr>
@@ -24674,10 +25159,10 @@
       <w:tcPr>
         <w:shd w:val="clear" w:color="ffffff" w:themeColor="light1" w:fill="ffffff" w:themeFill="light1"/>
         <w:tcBorders>
-          <w:top w:val="none"/>
-          <w:left w:val="none"/>
+          <w:top w:val="none" w:color="000000" w:sz="4" w:space="0"/>
+          <w:left w:val="none" w:color="000000" w:sz="4" w:space="0"/>
           <w:bottom w:val="single" w:color="000000" w:themeColor="accent6" w:themeTint="98" w:sz="4" w:space="0"/>
-          <w:right w:val="none"/>
+          <w:right w:val="none" w:color="000000" w:sz="4" w:space="0"/>
         </w:tcBorders>
       </w:tcPr>
     </w:tblStylePr>
@@ -24697,12 +25182,12 @@
         <w:tblBorders/>
       </w:tblPr>
       <w:tcPr>
-        <w:shd w:color="ffffff"/>
+        <w:shd w:val="clear" w:color="ffffff"/>
         <w:tcBorders>
-          <w:top w:val="none"/>
+          <w:top w:val="none" w:color="000000" w:sz="4" w:space="0"/>
           <w:left w:val="single" w:color="000000" w:themeColor="accent6" w:themeTint="98" w:sz="4" w:space="0"/>
-          <w:bottom w:val="none"/>
-          <w:right w:val="none"/>
+          <w:bottom w:val="none" w:color="000000" w:sz="4" w:space="0"/>
+          <w:right w:val="none" w:color="000000" w:sz="4" w:space="0"/>
         </w:tcBorders>
       </w:tcPr>
     </w:tblStylePr>
@@ -24725,9 +25210,9 @@
         <w:shd w:val="clear" w:color="ffffff" w:themeColor="light1" w:fill="ffffff" w:themeFill="light1"/>
         <w:tcBorders>
           <w:top w:val="single" w:color="000000" w:themeColor="accent6" w:themeTint="98" w:sz="4" w:space="0"/>
-          <w:left w:val="none"/>
-          <w:bottom w:val="none"/>
-          <w:right w:val="none"/>
+          <w:left w:val="none" w:color="000000" w:sz="4" w:space="0"/>
+          <w:bottom w:val="none" w:color="000000" w:sz="4" w:space="0"/>
+          <w:right w:val="none" w:color="000000" w:sz="4" w:space="0"/>
         </w:tcBorders>
       </w:tcPr>
     </w:tblStylePr>
@@ -24802,9 +25287,9 @@
       </w:tcPr>
     </w:tblStylePr>
   </w:style>
-  <w:style w:type="table" w:styleId="117">
+  <w:style w:type="table" w:styleId="806">
     <w:name w:val="Lined - Accent"/>
-    <w:basedOn w:val="665"/>
+    <w:basedOn w:val="887"/>
     <w:uiPriority w:val="99"/>
     <w:pPr>
       <w:pBdr/>
@@ -25039,9 +25524,9 @@
       </w:tcPr>
     </w:tblStylePr>
   </w:style>
-  <w:style w:type="table" w:styleId="118">
+  <w:style w:type="table" w:styleId="807">
     <w:name w:val="Lined - Accent 1"/>
-    <w:basedOn w:val="665"/>
+    <w:basedOn w:val="887"/>
     <w:uiPriority w:val="99"/>
     <w:pPr>
       <w:pBdr/>
@@ -25276,9 +25761,9 @@
       </w:tcPr>
     </w:tblStylePr>
   </w:style>
-  <w:style w:type="table" w:styleId="119">
+  <w:style w:type="table" w:styleId="808">
     <w:name w:val="Lined - Accent 2"/>
-    <w:basedOn w:val="665"/>
+    <w:basedOn w:val="887"/>
     <w:uiPriority w:val="99"/>
     <w:pPr>
       <w:pBdr/>
@@ -25513,9 +25998,9 @@
       </w:tcPr>
     </w:tblStylePr>
   </w:style>
-  <w:style w:type="table" w:styleId="120">
+  <w:style w:type="table" w:styleId="809">
     <w:name w:val="Lined - Accent 3"/>
-    <w:basedOn w:val="665"/>
+    <w:basedOn w:val="887"/>
     <w:uiPriority w:val="99"/>
     <w:pPr>
       <w:pBdr/>
@@ -25750,9 +26235,9 @@
       </w:tcPr>
     </w:tblStylePr>
   </w:style>
-  <w:style w:type="table" w:styleId="121">
+  <w:style w:type="table" w:styleId="810">
     <w:name w:val="Lined - Accent 4"/>
-    <w:basedOn w:val="665"/>
+    <w:basedOn w:val="887"/>
     <w:uiPriority w:val="99"/>
     <w:pPr>
       <w:pBdr/>
@@ -25987,9 +26472,9 @@
       </w:tcPr>
     </w:tblStylePr>
   </w:style>
-  <w:style w:type="table" w:styleId="122">
+  <w:style w:type="table" w:styleId="811">
     <w:name w:val="Lined - Accent 5"/>
-    <w:basedOn w:val="665"/>
+    <w:basedOn w:val="887"/>
     <w:uiPriority w:val="99"/>
     <w:pPr>
       <w:pBdr/>
@@ -26224,9 +26709,9 @@
       </w:tcPr>
     </w:tblStylePr>
   </w:style>
-  <w:style w:type="table" w:styleId="123">
+  <w:style w:type="table" w:styleId="812">
     <w:name w:val="Lined - Accent 6"/>
-    <w:basedOn w:val="665"/>
+    <w:basedOn w:val="887"/>
     <w:uiPriority w:val="99"/>
     <w:pPr>
       <w:pBdr/>
@@ -26461,9 +26946,9 @@
       </w:tcPr>
     </w:tblStylePr>
   </w:style>
-  <w:style w:type="table" w:styleId="124">
+  <w:style w:type="table" w:styleId="813">
     <w:name w:val="Bordered &amp; Lined - Accent"/>
-    <w:basedOn w:val="665"/>
+    <w:basedOn w:val="887"/>
     <w:uiPriority w:val="99"/>
     <w:pPr>
       <w:pBdr/>
@@ -26705,9 +27190,9 @@
       </w:tcPr>
     </w:tblStylePr>
   </w:style>
-  <w:style w:type="table" w:styleId="125">
+  <w:style w:type="table" w:styleId="814">
     <w:name w:val="Bordered &amp; Lined - Accent 1"/>
-    <w:basedOn w:val="665"/>
+    <w:basedOn w:val="887"/>
     <w:uiPriority w:val="99"/>
     <w:pPr>
       <w:pBdr/>
@@ -26949,9 +27434,9 @@
       </w:tcPr>
     </w:tblStylePr>
   </w:style>
-  <w:style w:type="table" w:styleId="126">
+  <w:style w:type="table" w:styleId="815">
     <w:name w:val="Bordered &amp; Lined - Accent 2"/>
-    <w:basedOn w:val="665"/>
+    <w:basedOn w:val="887"/>
     <w:uiPriority w:val="99"/>
     <w:pPr>
       <w:pBdr/>
@@ -27193,9 +27678,9 @@
       </w:tcPr>
     </w:tblStylePr>
   </w:style>
-  <w:style w:type="table" w:styleId="127">
+  <w:style w:type="table" w:styleId="816">
     <w:name w:val="Bordered &amp; Lined - Accent 3"/>
-    <w:basedOn w:val="665"/>
+    <w:basedOn w:val="887"/>
     <w:uiPriority w:val="99"/>
     <w:pPr>
       <w:pBdr/>
@@ -27437,9 +27922,9 @@
       </w:tcPr>
     </w:tblStylePr>
   </w:style>
-  <w:style w:type="table" w:styleId="128">
+  <w:style w:type="table" w:styleId="817">
     <w:name w:val="Bordered &amp; Lined - Accent 4"/>
-    <w:basedOn w:val="665"/>
+    <w:basedOn w:val="887"/>
     <w:uiPriority w:val="99"/>
     <w:pPr>
       <w:pBdr/>
@@ -27681,9 +28166,9 @@
       </w:tcPr>
     </w:tblStylePr>
   </w:style>
-  <w:style w:type="table" w:styleId="129">
+  <w:style w:type="table" w:styleId="818">
     <w:name w:val="Bordered &amp; Lined - Accent 5"/>
-    <w:basedOn w:val="665"/>
+    <w:basedOn w:val="887"/>
     <w:uiPriority w:val="99"/>
     <w:pPr>
       <w:pBdr/>
@@ -27925,9 +28410,9 @@
       </w:tcPr>
     </w:tblStylePr>
   </w:style>
-  <w:style w:type="table" w:styleId="130">
+  <w:style w:type="table" w:styleId="819">
     <w:name w:val="Bordered &amp; Lined - Accent 6"/>
-    <w:basedOn w:val="665"/>
+    <w:basedOn w:val="887"/>
     <w:uiPriority w:val="99"/>
     <w:pPr>
       <w:pBdr/>
@@ -28169,9 +28654,9 @@
       </w:tcPr>
     </w:tblStylePr>
   </w:style>
-  <w:style w:type="table" w:styleId="131">
+  <w:style w:type="table" w:styleId="820">
     <w:name w:val="Bordered"/>
-    <w:basedOn w:val="665"/>
+    <w:basedOn w:val="887"/>
     <w:uiPriority w:val="99"/>
     <w:pPr>
       <w:pBdr/>
@@ -28400,9 +28885,9 @@
       </w:tcPr>
     </w:tblStylePr>
   </w:style>
-  <w:style w:type="table" w:styleId="132">
+  <w:style w:type="table" w:styleId="821">
     <w:name w:val="Bordered - Accent 1"/>
-    <w:basedOn w:val="665"/>
+    <w:basedOn w:val="887"/>
     <w:uiPriority w:val="99"/>
     <w:pPr>
       <w:pBdr/>
@@ -28631,9 +29116,9 @@
       </w:tcPr>
     </w:tblStylePr>
   </w:style>
-  <w:style w:type="table" w:styleId="133">
+  <w:style w:type="table" w:styleId="822">
     <w:name w:val="Bordered - Accent 2"/>
-    <w:basedOn w:val="665"/>
+    <w:basedOn w:val="887"/>
     <w:uiPriority w:val="99"/>
     <w:pPr>
       <w:pBdr/>
@@ -28862,9 +29347,9 @@
       </w:tcPr>
     </w:tblStylePr>
   </w:style>
-  <w:style w:type="table" w:styleId="134">
+  <w:style w:type="table" w:styleId="823">
     <w:name w:val="Bordered - Accent 3"/>
-    <w:basedOn w:val="665"/>
+    <w:basedOn w:val="887"/>
     <w:uiPriority w:val="99"/>
     <w:pPr>
       <w:pBdr/>
@@ -29093,9 +29578,9 @@
       </w:tcPr>
     </w:tblStylePr>
   </w:style>
-  <w:style w:type="table" w:styleId="135">
+  <w:style w:type="table" w:styleId="824">
     <w:name w:val="Bordered - Accent 4"/>
-    <w:basedOn w:val="665"/>
+    <w:basedOn w:val="887"/>
     <w:uiPriority w:val="99"/>
     <w:pPr>
       <w:pBdr/>
@@ -29324,9 +29809,9 @@
       </w:tcPr>
     </w:tblStylePr>
   </w:style>
-  <w:style w:type="table" w:styleId="136">
+  <w:style w:type="table" w:styleId="825">
     <w:name w:val="Bordered - Accent 5"/>
-    <w:basedOn w:val="665"/>
+    <w:basedOn w:val="887"/>
     <w:uiPriority w:val="99"/>
     <w:pPr>
       <w:pBdr/>
@@ -29555,9 +30040,9 @@
       </w:tcPr>
     </w:tblStylePr>
   </w:style>
-  <w:style w:type="table" w:styleId="137">
+  <w:style w:type="table" w:styleId="826">
     <w:name w:val="Bordered - Accent 6"/>
-    <w:basedOn w:val="665"/>
+    <w:basedOn w:val="887"/>
     <w:uiPriority w:val="99"/>
     <w:pPr>
       <w:pBdr/>
@@ -29786,11 +30271,11 @@
       </w:tcPr>
     </w:tblStylePr>
   </w:style>
-  <w:style w:type="paragraph" w:styleId="139">
+  <w:style w:type="paragraph" w:styleId="827">
     <w:name w:val="Heading 1"/>
-    <w:basedOn w:val="664"/>
-    <w:next w:val="664"/>
-    <w:link w:val="150"/>
+    <w:basedOn w:val="886"/>
+    <w:next w:val="886"/>
+    <w:link w:val="837"/>
     <w:uiPriority w:val="9"/>
     <w:qFormat/>
     <w:pPr>
@@ -29808,11 +30293,11 @@
       <w:szCs w:val="40"/>
     </w:rPr>
   </w:style>
-  <w:style w:type="paragraph" w:styleId="140">
+  <w:style w:type="paragraph" w:styleId="828">
     <w:name w:val="Heading 2"/>
-    <w:basedOn w:val="664"/>
-    <w:next w:val="664"/>
-    <w:link w:val="151"/>
+    <w:basedOn w:val="886"/>
+    <w:next w:val="886"/>
+    <w:link w:val="838"/>
     <w:uiPriority w:val="9"/>
     <w:unhideWhenUsed/>
     <w:qFormat/>
@@ -29831,11 +30316,11 @@
       <w:szCs w:val="32"/>
     </w:rPr>
   </w:style>
-  <w:style w:type="paragraph" w:styleId="141">
+  <w:style w:type="paragraph" w:styleId="829">
     <w:name w:val="Heading 3"/>
-    <w:basedOn w:val="664"/>
-    <w:next w:val="664"/>
-    <w:link w:val="152"/>
+    <w:basedOn w:val="886"/>
+    <w:next w:val="886"/>
+    <w:link w:val="839"/>
     <w:uiPriority w:val="9"/>
     <w:unhideWhenUsed/>
     <w:qFormat/>
@@ -29854,11 +30339,11 @@
       <w:szCs w:val="28"/>
     </w:rPr>
   </w:style>
-  <w:style w:type="paragraph" w:styleId="142">
+  <w:style w:type="paragraph" w:styleId="830">
     <w:name w:val="Heading 4"/>
-    <w:basedOn w:val="664"/>
-    <w:next w:val="664"/>
-    <w:link w:val="153"/>
+    <w:basedOn w:val="886"/>
+    <w:next w:val="886"/>
+    <w:link w:val="840"/>
     <w:uiPriority w:val="9"/>
     <w:unhideWhenUsed/>
     <w:qFormat/>
@@ -29877,11 +30362,11 @@
       <w:color w:val="0f4761" w:themeColor="accent1" w:themeShade="BF"/>
     </w:rPr>
   </w:style>
-  <w:style w:type="paragraph" w:styleId="143">
+  <w:style w:type="paragraph" w:styleId="831">
     <w:name w:val="Heading 5"/>
-    <w:basedOn w:val="664"/>
-    <w:next w:val="664"/>
-    <w:link w:val="154"/>
+    <w:basedOn w:val="886"/>
+    <w:next w:val="886"/>
+    <w:link w:val="841"/>
     <w:uiPriority w:val="9"/>
     <w:unhideWhenUsed/>
     <w:qFormat/>
@@ -29898,11 +30383,11 @@
       <w:color w:val="0f4761" w:themeColor="accent1" w:themeShade="BF"/>
     </w:rPr>
   </w:style>
-  <w:style w:type="paragraph" w:styleId="144">
+  <w:style w:type="paragraph" w:styleId="832">
     <w:name w:val="Heading 6"/>
-    <w:basedOn w:val="664"/>
-    <w:next w:val="664"/>
-    <w:link w:val="155"/>
+    <w:basedOn w:val="886"/>
+    <w:next w:val="886"/>
+    <w:link w:val="842"/>
     <w:uiPriority w:val="9"/>
     <w:unhideWhenUsed/>
     <w:qFormat/>
@@ -29921,11 +30406,11 @@
       <w:color w:val="595959" w:themeColor="text1" w:themeTint="A6"/>
     </w:rPr>
   </w:style>
-  <w:style w:type="paragraph" w:styleId="145">
+  <w:style w:type="paragraph" w:styleId="833">
     <w:name w:val="Heading 7"/>
-    <w:basedOn w:val="664"/>
-    <w:next w:val="664"/>
-    <w:link w:val="156"/>
+    <w:basedOn w:val="886"/>
+    <w:next w:val="886"/>
+    <w:link w:val="843"/>
     <w:uiPriority w:val="9"/>
     <w:unhideWhenUsed/>
     <w:qFormat/>
@@ -29942,11 +30427,11 @@
       <w:color w:val="595959" w:themeColor="text1" w:themeTint="A6"/>
     </w:rPr>
   </w:style>
-  <w:style w:type="paragraph" w:styleId="146">
+  <w:style w:type="paragraph" w:styleId="834">
     <w:name w:val="Heading 8"/>
-    <w:basedOn w:val="664"/>
-    <w:next w:val="664"/>
-    <w:link w:val="157"/>
+    <w:basedOn w:val="886"/>
+    <w:next w:val="886"/>
+    <w:link w:val="844"/>
     <w:uiPriority w:val="9"/>
     <w:unhideWhenUsed/>
     <w:qFormat/>
@@ -29965,11 +30450,11 @@
       <w:color w:val="272727" w:themeColor="text1" w:themeTint="D8"/>
     </w:rPr>
   </w:style>
-  <w:style w:type="paragraph" w:styleId="147">
+  <w:style w:type="paragraph" w:styleId="835">
     <w:name w:val="Heading 9"/>
-    <w:basedOn w:val="664"/>
-    <w:next w:val="664"/>
-    <w:link w:val="158"/>
+    <w:basedOn w:val="886"/>
+    <w:next w:val="886"/>
+    <w:link w:val="845"/>
     <w:uiPriority w:val="9"/>
     <w:unhideWhenUsed/>
     <w:qFormat/>
@@ -29988,7 +30473,7 @@
       <w:color w:val="272727" w:themeColor="text1" w:themeTint="D8"/>
     </w:rPr>
   </w:style>
-  <w:style w:type="character" w:styleId="148" w:default="1">
+  <w:style w:type="character" w:styleId="836" w:default="1">
     <w:name w:val="Default Paragraph Font"/>
     <w:uiPriority w:val="1"/>
     <w:semiHidden/>
@@ -29999,10 +30484,10 @@
       <w:ind/>
     </w:pPr>
   </w:style>
-  <w:style w:type="character" w:styleId="150">
+  <w:style w:type="character" w:styleId="837">
     <w:name w:val="Heading 1 Char"/>
-    <w:basedOn w:val="148"/>
-    <w:link w:val="139"/>
+    <w:basedOn w:val="836"/>
+    <w:link w:val="827"/>
     <w:uiPriority w:val="9"/>
     <w:pPr>
       <w:pBdr/>
@@ -30016,10 +30501,10 @@
       <w:szCs w:val="40"/>
     </w:rPr>
   </w:style>
-  <w:style w:type="character" w:styleId="151">
+  <w:style w:type="character" w:styleId="838">
     <w:name w:val="Heading 2 Char"/>
-    <w:basedOn w:val="148"/>
-    <w:link w:val="140"/>
+    <w:basedOn w:val="836"/>
+    <w:link w:val="828"/>
     <w:uiPriority w:val="9"/>
     <w:pPr>
       <w:pBdr/>
@@ -30033,10 +30518,10 @@
       <w:szCs w:val="32"/>
     </w:rPr>
   </w:style>
-  <w:style w:type="character" w:styleId="152">
+  <w:style w:type="character" w:styleId="839">
     <w:name w:val="Heading 3 Char"/>
-    <w:basedOn w:val="148"/>
-    <w:link w:val="141"/>
+    <w:basedOn w:val="836"/>
+    <w:link w:val="829"/>
     <w:uiPriority w:val="9"/>
     <w:pPr>
       <w:pBdr/>
@@ -30050,10 +30535,10 @@
       <w:szCs w:val="28"/>
     </w:rPr>
   </w:style>
-  <w:style w:type="character" w:styleId="153">
+  <w:style w:type="character" w:styleId="840">
     <w:name w:val="Heading 4 Char"/>
-    <w:basedOn w:val="148"/>
-    <w:link w:val="142"/>
+    <w:basedOn w:val="836"/>
+    <w:link w:val="830"/>
     <w:uiPriority w:val="9"/>
     <w:pPr>
       <w:pBdr/>
@@ -30067,10 +30552,10 @@
       <w:color w:val="0f4761" w:themeColor="accent1" w:themeShade="BF"/>
     </w:rPr>
   </w:style>
-  <w:style w:type="character" w:styleId="154">
+  <w:style w:type="character" w:styleId="841">
     <w:name w:val="Heading 5 Char"/>
-    <w:basedOn w:val="148"/>
-    <w:link w:val="143"/>
+    <w:basedOn w:val="836"/>
+    <w:link w:val="831"/>
     <w:uiPriority w:val="9"/>
     <w:pPr>
       <w:pBdr/>
@@ -30082,10 +30567,10 @@
       <w:color w:val="0f4761" w:themeColor="accent1" w:themeShade="BF"/>
     </w:rPr>
   </w:style>
-  <w:style w:type="character" w:styleId="155">
+  <w:style w:type="character" w:styleId="842">
     <w:name w:val="Heading 6 Char"/>
-    <w:basedOn w:val="148"/>
-    <w:link w:val="144"/>
+    <w:basedOn w:val="836"/>
+    <w:link w:val="832"/>
     <w:uiPriority w:val="9"/>
     <w:pPr>
       <w:pBdr/>
@@ -30099,10 +30584,10 @@
       <w:color w:val="595959" w:themeColor="text1" w:themeTint="A6"/>
     </w:rPr>
   </w:style>
-  <w:style w:type="character" w:styleId="156">
+  <w:style w:type="character" w:styleId="843">
     <w:name w:val="Heading 7 Char"/>
-    <w:basedOn w:val="148"/>
-    <w:link w:val="145"/>
+    <w:basedOn w:val="836"/>
+    <w:link w:val="833"/>
     <w:uiPriority w:val="9"/>
     <w:pPr>
       <w:pBdr/>
@@ -30114,10 +30599,10 @@
       <w:color w:val="595959" w:themeColor="text1" w:themeTint="A6"/>
     </w:rPr>
   </w:style>
-  <w:style w:type="character" w:styleId="157">
+  <w:style w:type="character" w:styleId="844">
     <w:name w:val="Heading 8 Char"/>
-    <w:basedOn w:val="148"/>
-    <w:link w:val="146"/>
+    <w:basedOn w:val="836"/>
+    <w:link w:val="834"/>
     <w:uiPriority w:val="9"/>
     <w:pPr>
       <w:pBdr/>
@@ -30131,10 +30616,10 @@
       <w:color w:val="272727" w:themeColor="text1" w:themeTint="D8"/>
     </w:rPr>
   </w:style>
-  <w:style w:type="character" w:styleId="158">
+  <w:style w:type="character" w:styleId="845">
     <w:name w:val="Heading 9 Char"/>
-    <w:basedOn w:val="148"/>
-    <w:link w:val="147"/>
+    <w:basedOn w:val="836"/>
+    <w:link w:val="835"/>
     <w:uiPriority w:val="9"/>
     <w:pPr>
       <w:pBdr/>
@@ -30148,11 +30633,11 @@
       <w:color w:val="272727" w:themeColor="text1" w:themeTint="D8"/>
     </w:rPr>
   </w:style>
-  <w:style w:type="paragraph" w:styleId="159">
+  <w:style w:type="paragraph" w:styleId="846">
     <w:name w:val="Title"/>
-    <w:basedOn w:val="664"/>
-    <w:next w:val="664"/>
-    <w:link w:val="160"/>
+    <w:basedOn w:val="886"/>
+    <w:next w:val="886"/>
+    <w:link w:val="847"/>
     <w:uiPriority w:val="10"/>
     <w:qFormat/>
     <w:pPr>
@@ -30168,10 +30653,10 @@
       <w:szCs w:val="56"/>
     </w:rPr>
   </w:style>
-  <w:style w:type="character" w:styleId="160">
+  <w:style w:type="character" w:styleId="847">
     <w:name w:val="Title Char"/>
-    <w:basedOn w:val="148"/>
-    <w:link w:val="159"/>
+    <w:basedOn w:val="836"/>
+    <w:link w:val="846"/>
     <w:uiPriority w:val="10"/>
     <w:pPr>
       <w:pBdr/>
@@ -30185,11 +30670,11 @@
       <w:szCs w:val="56"/>
     </w:rPr>
   </w:style>
-  <w:style w:type="paragraph" w:styleId="161">
+  <w:style w:type="paragraph" w:styleId="848">
     <w:name w:val="Subtitle"/>
-    <w:basedOn w:val="664"/>
-    <w:next w:val="664"/>
-    <w:link w:val="162"/>
+    <w:basedOn w:val="886"/>
+    <w:next w:val="886"/>
+    <w:link w:val="849"/>
     <w:uiPriority w:val="11"/>
     <w:qFormat/>
     <w:pPr>
@@ -30207,10 +30692,10 @@
       <w:szCs w:val="28"/>
     </w:rPr>
   </w:style>
-  <w:style w:type="character" w:styleId="162">
+  <w:style w:type="character" w:styleId="849">
     <w:name w:val="Subtitle Char"/>
-    <w:basedOn w:val="148"/>
-    <w:link w:val="161"/>
+    <w:basedOn w:val="836"/>
+    <w:link w:val="848"/>
     <w:uiPriority w:val="11"/>
     <w:pPr>
       <w:pBdr/>
@@ -30224,11 +30709,11 @@
       <w:szCs w:val="28"/>
     </w:rPr>
   </w:style>
-  <w:style w:type="paragraph" w:styleId="163">
+  <w:style w:type="paragraph" w:styleId="850">
     <w:name w:val="Quote"/>
-    <w:basedOn w:val="664"/>
-    <w:next w:val="664"/>
-    <w:link w:val="164"/>
+    <w:basedOn w:val="886"/>
+    <w:next w:val="886"/>
+    <w:link w:val="851"/>
     <w:uiPriority w:val="29"/>
     <w:qFormat/>
     <w:pPr>
@@ -30243,10 +30728,10 @@
       <w:color w:val="404040" w:themeColor="text1" w:themeTint="BF"/>
     </w:rPr>
   </w:style>
-  <w:style w:type="character" w:styleId="164">
+  <w:style w:type="character" w:styleId="851">
     <w:name w:val="Quote Char"/>
-    <w:basedOn w:val="148"/>
-    <w:link w:val="163"/>
+    <w:basedOn w:val="836"/>
+    <w:link w:val="850"/>
     <w:uiPriority w:val="29"/>
     <w:pPr>
       <w:pBdr/>
@@ -30259,9 +30744,9 @@
       <w:color w:val="404040" w:themeColor="text1" w:themeTint="BF"/>
     </w:rPr>
   </w:style>
-  <w:style w:type="character" w:styleId="166">
+  <w:style w:type="character" w:styleId="852">
     <w:name w:val="Intense Emphasis"/>
-    <w:basedOn w:val="148"/>
+    <w:basedOn w:val="836"/>
     <w:uiPriority w:val="21"/>
     <w:qFormat/>
     <w:pPr>
@@ -30275,11 +30760,11 @@
       <w:color w:val="0f4761" w:themeColor="accent1" w:themeShade="BF"/>
     </w:rPr>
   </w:style>
-  <w:style w:type="paragraph" w:styleId="167">
+  <w:style w:type="paragraph" w:styleId="853">
     <w:name w:val="Intense Quote"/>
-    <w:basedOn w:val="664"/>
-    <w:next w:val="664"/>
-    <w:link w:val="168"/>
+    <w:basedOn w:val="886"/>
+    <w:next w:val="886"/>
+    <w:link w:val="854"/>
     <w:uiPriority w:val="30"/>
     <w:qFormat/>
     <w:pPr>
@@ -30297,10 +30782,10 @@
       <w:color w:val="0f4761" w:themeColor="accent1" w:themeShade="BF"/>
     </w:rPr>
   </w:style>
-  <w:style w:type="character" w:styleId="168">
+  <w:style w:type="character" w:styleId="854">
     <w:name w:val="Intense Quote Char"/>
-    <w:basedOn w:val="148"/>
-    <w:link w:val="167"/>
+    <w:basedOn w:val="836"/>
+    <w:link w:val="853"/>
     <w:uiPriority w:val="30"/>
     <w:pPr>
       <w:pBdr/>
@@ -30313,9 +30798,9 @@
       <w:color w:val="0f4761" w:themeColor="accent1" w:themeShade="BF"/>
     </w:rPr>
   </w:style>
-  <w:style w:type="character" w:styleId="169">
+  <w:style w:type="character" w:styleId="855">
     <w:name w:val="Intense Reference"/>
-    <w:basedOn w:val="148"/>
+    <w:basedOn w:val="836"/>
     <w:uiPriority w:val="32"/>
     <w:qFormat/>
     <w:pPr>
@@ -30331,9 +30816,9 @@
       <w:spacing w:val="5"/>
     </w:rPr>
   </w:style>
-  <w:style w:type="character" w:styleId="171">
+  <w:style w:type="character" w:styleId="856">
     <w:name w:val="Subtle Emphasis"/>
-    <w:basedOn w:val="148"/>
+    <w:basedOn w:val="836"/>
     <w:uiPriority w:val="19"/>
     <w:qFormat/>
     <w:pPr>
@@ -30347,9 +30832,9 @@
       <w:color w:val="404040" w:themeColor="text1" w:themeTint="BF"/>
     </w:rPr>
   </w:style>
-  <w:style w:type="character" w:styleId="172">
+  <w:style w:type="character" w:styleId="857">
     <w:name w:val="Emphasis"/>
-    <w:basedOn w:val="148"/>
+    <w:basedOn w:val="836"/>
     <w:uiPriority w:val="20"/>
     <w:qFormat/>
     <w:pPr>
@@ -30362,9 +30847,9 @@
       <w:iCs/>
     </w:rPr>
   </w:style>
-  <w:style w:type="character" w:styleId="173">
+  <w:style w:type="character" w:styleId="858">
     <w:name w:val="Strong"/>
-    <w:basedOn w:val="148"/>
+    <w:basedOn w:val="836"/>
     <w:uiPriority w:val="22"/>
     <w:qFormat/>
     <w:pPr>
@@ -30377,9 +30862,9 @@
       <w:bCs/>
     </w:rPr>
   </w:style>
-  <w:style w:type="character" w:styleId="174">
+  <w:style w:type="character" w:styleId="859">
     <w:name w:val="Subtle Reference"/>
-    <w:basedOn w:val="148"/>
+    <w:basedOn w:val="836"/>
     <w:uiPriority w:val="31"/>
     <w:qFormat/>
     <w:pPr>
@@ -30392,9 +30877,9 @@
       <w:color w:val="5a5a5a" w:themeColor="text1" w:themeTint="A5"/>
     </w:rPr>
   </w:style>
-  <w:style w:type="character" w:styleId="175">
+  <w:style w:type="character" w:styleId="860">
     <w:name w:val="Book Title"/>
-    <w:basedOn w:val="148"/>
+    <w:basedOn w:val="836"/>
     <w:uiPriority w:val="33"/>
     <w:qFormat/>
     <w:pPr>
@@ -30410,10 +30895,10 @@
       <w:spacing w:val="5"/>
     </w:rPr>
   </w:style>
-  <w:style w:type="paragraph" w:styleId="176">
+  <w:style w:type="paragraph" w:styleId="861">
     <w:name w:val="Header"/>
-    <w:basedOn w:val="664"/>
-    <w:link w:val="177"/>
+    <w:basedOn w:val="886"/>
+    <w:link w:val="862"/>
     <w:uiPriority w:val="99"/>
     <w:unhideWhenUsed/>
     <w:pPr>
@@ -30426,10 +30911,10 @@
       <w:ind/>
     </w:pPr>
   </w:style>
-  <w:style w:type="character" w:styleId="177">
+  <w:style w:type="character" w:styleId="862">
     <w:name w:val="Header Char"/>
-    <w:basedOn w:val="148"/>
-    <w:link w:val="176"/>
+    <w:basedOn w:val="836"/>
+    <w:link w:val="861"/>
     <w:uiPriority w:val="99"/>
     <w:pPr>
       <w:pBdr/>
@@ -30437,10 +30922,10 @@
       <w:ind/>
     </w:pPr>
   </w:style>
-  <w:style w:type="paragraph" w:styleId="178">
+  <w:style w:type="paragraph" w:styleId="863">
     <w:name w:val="Footer"/>
-    <w:basedOn w:val="664"/>
-    <w:link w:val="179"/>
+    <w:basedOn w:val="886"/>
+    <w:link w:val="864"/>
     <w:uiPriority w:val="99"/>
     <w:unhideWhenUsed/>
     <w:pPr>
@@ -30453,10 +30938,10 @@
       <w:ind/>
     </w:pPr>
   </w:style>
-  <w:style w:type="character" w:styleId="179">
+  <w:style w:type="character" w:styleId="864">
     <w:name w:val="Footer Char"/>
-    <w:basedOn w:val="148"/>
-    <w:link w:val="178"/>
+    <w:basedOn w:val="836"/>
+    <w:link w:val="863"/>
     <w:uiPriority w:val="99"/>
     <w:pPr>
       <w:pBdr/>
@@ -30464,10 +30949,10 @@
       <w:ind/>
     </w:pPr>
   </w:style>
-  <w:style w:type="paragraph" w:styleId="180">
+  <w:style w:type="paragraph" w:styleId="865">
     <w:name w:val="Caption"/>
-    <w:basedOn w:val="664"/>
-    <w:next w:val="664"/>
+    <w:basedOn w:val="886"/>
+    <w:next w:val="886"/>
     <w:uiPriority w:val="35"/>
     <w:unhideWhenUsed/>
     <w:qFormat/>
@@ -30484,10 +30969,10 @@
       <w:szCs w:val="18"/>
     </w:rPr>
   </w:style>
-  <w:style w:type="paragraph" w:styleId="181">
+  <w:style w:type="paragraph" w:styleId="866">
     <w:name w:val="footnote text"/>
-    <w:basedOn w:val="664"/>
-    <w:link w:val="182"/>
+    <w:basedOn w:val="886"/>
+    <w:link w:val="867"/>
     <w:uiPriority w:val="99"/>
     <w:semiHidden/>
     <w:unhideWhenUsed/>
@@ -30501,10 +30986,10 @@
       <w:szCs w:val="20"/>
     </w:rPr>
   </w:style>
-  <w:style w:type="character" w:styleId="182">
+  <w:style w:type="character" w:styleId="867">
     <w:name w:val="Footnote Text Char"/>
-    <w:basedOn w:val="148"/>
-    <w:link w:val="181"/>
+    <w:basedOn w:val="836"/>
+    <w:link w:val="866"/>
     <w:uiPriority w:val="99"/>
     <w:semiHidden/>
     <w:pPr>
@@ -30517,9 +31002,9 @@
       <w:szCs w:val="20"/>
     </w:rPr>
   </w:style>
-  <w:style w:type="character" w:styleId="183">
+  <w:style w:type="character" w:styleId="868">
     <w:name w:val="footnote reference"/>
-    <w:basedOn w:val="148"/>
+    <w:basedOn w:val="836"/>
     <w:uiPriority w:val="99"/>
     <w:semiHidden/>
     <w:unhideWhenUsed/>
@@ -30532,10 +31017,10 @@
       <w:vertAlign w:val="superscript"/>
     </w:rPr>
   </w:style>
-  <w:style w:type="paragraph" w:styleId="184">
+  <w:style w:type="paragraph" w:styleId="869">
     <w:name w:val="endnote text"/>
-    <w:basedOn w:val="664"/>
-    <w:link w:val="185"/>
+    <w:basedOn w:val="886"/>
+    <w:link w:val="870"/>
     <w:uiPriority w:val="99"/>
     <w:semiHidden/>
     <w:unhideWhenUsed/>
@@ -30549,10 +31034,10 @@
       <w:szCs w:val="20"/>
     </w:rPr>
   </w:style>
-  <w:style w:type="character" w:styleId="185">
+  <w:style w:type="character" w:styleId="870">
     <w:name w:val="Endnote Text Char"/>
-    <w:basedOn w:val="148"/>
-    <w:link w:val="184"/>
+    <w:basedOn w:val="836"/>
+    <w:link w:val="869"/>
     <w:uiPriority w:val="99"/>
     <w:semiHidden/>
     <w:pPr>
@@ -30565,9 +31050,9 @@
       <w:szCs w:val="20"/>
     </w:rPr>
   </w:style>
-  <w:style w:type="character" w:styleId="186">
+  <w:style w:type="character" w:styleId="871">
     <w:name w:val="endnote reference"/>
-    <w:basedOn w:val="148"/>
+    <w:basedOn w:val="836"/>
     <w:uiPriority w:val="99"/>
     <w:semiHidden/>
     <w:unhideWhenUsed/>
@@ -30580,9 +31065,9 @@
       <w:vertAlign w:val="superscript"/>
     </w:rPr>
   </w:style>
-  <w:style w:type="character" w:styleId="187">
+  <w:style w:type="character" w:styleId="872">
     <w:name w:val="Hyperlink"/>
-    <w:basedOn w:val="148"/>
+    <w:basedOn w:val="836"/>
     <w:uiPriority w:val="99"/>
     <w:unhideWhenUsed/>
     <w:pPr>
@@ -30595,9 +31080,9 @@
       <w:u w:val="single"/>
     </w:rPr>
   </w:style>
-  <w:style w:type="character" w:styleId="188">
+  <w:style w:type="character" w:styleId="873">
     <w:name w:val="FollowedHyperlink"/>
-    <w:basedOn w:val="148"/>
+    <w:basedOn w:val="836"/>
     <w:uiPriority w:val="99"/>
     <w:semiHidden/>
     <w:unhideWhenUsed/>
@@ -30611,10 +31096,10 @@
       <w:u w:val="single"/>
     </w:rPr>
   </w:style>
-  <w:style w:type="paragraph" w:styleId="189">
+  <w:style w:type="paragraph" w:styleId="874">
     <w:name w:val="toc 1"/>
-    <w:basedOn w:val="664"/>
-    <w:next w:val="664"/>
+    <w:basedOn w:val="886"/>
+    <w:next w:val="886"/>
     <w:uiPriority w:val="39"/>
     <w:unhideWhenUsed/>
     <w:pPr>
@@ -30623,10 +31108,10 @@
       <w:ind/>
     </w:pPr>
   </w:style>
-  <w:style w:type="paragraph" w:styleId="190">
+  <w:style w:type="paragraph" w:styleId="875">
     <w:name w:val="toc 2"/>
-    <w:basedOn w:val="664"/>
-    <w:next w:val="664"/>
+    <w:basedOn w:val="886"/>
+    <w:next w:val="886"/>
     <w:uiPriority w:val="39"/>
     <w:unhideWhenUsed/>
     <w:pPr>
@@ -30635,10 +31120,10 @@
       <w:ind w:left="220"/>
     </w:pPr>
   </w:style>
-  <w:style w:type="paragraph" w:styleId="191">
+  <w:style w:type="paragraph" w:styleId="876">
     <w:name w:val="toc 3"/>
-    <w:basedOn w:val="664"/>
-    <w:next w:val="664"/>
+    <w:basedOn w:val="886"/>
+    <w:next w:val="886"/>
     <w:uiPriority w:val="39"/>
     <w:unhideWhenUsed/>
     <w:pPr>
@@ -30647,10 +31132,10 @@
       <w:ind w:left="440"/>
     </w:pPr>
   </w:style>
-  <w:style w:type="paragraph" w:styleId="192">
+  <w:style w:type="paragraph" w:styleId="877">
     <w:name w:val="toc 4"/>
-    <w:basedOn w:val="664"/>
-    <w:next w:val="664"/>
+    <w:basedOn w:val="886"/>
+    <w:next w:val="886"/>
     <w:uiPriority w:val="39"/>
     <w:unhideWhenUsed/>
     <w:pPr>
@@ -30659,10 +31144,10 @@
       <w:ind w:left="660"/>
     </w:pPr>
   </w:style>
-  <w:style w:type="paragraph" w:styleId="193">
+  <w:style w:type="paragraph" w:styleId="878">
     <w:name w:val="toc 5"/>
-    <w:basedOn w:val="664"/>
-    <w:next w:val="664"/>
+    <w:basedOn w:val="886"/>
+    <w:next w:val="886"/>
     <w:uiPriority w:val="39"/>
     <w:unhideWhenUsed/>
     <w:pPr>
@@ -30671,10 +31156,10 @@
       <w:ind w:left="880"/>
     </w:pPr>
   </w:style>
-  <w:style w:type="paragraph" w:styleId="194">
+  <w:style w:type="paragraph" w:styleId="879">
     <w:name w:val="toc 6"/>
-    <w:basedOn w:val="664"/>
-    <w:next w:val="664"/>
+    <w:basedOn w:val="886"/>
+    <w:next w:val="886"/>
     <w:uiPriority w:val="39"/>
     <w:unhideWhenUsed/>
     <w:pPr>
@@ -30683,10 +31168,10 @@
       <w:ind w:left="1100"/>
     </w:pPr>
   </w:style>
-  <w:style w:type="paragraph" w:styleId="195">
+  <w:style w:type="paragraph" w:styleId="880">
     <w:name w:val="toc 7"/>
-    <w:basedOn w:val="664"/>
-    <w:next w:val="664"/>
+    <w:basedOn w:val="886"/>
+    <w:next w:val="886"/>
     <w:uiPriority w:val="39"/>
     <w:unhideWhenUsed/>
     <w:pPr>
@@ -30695,10 +31180,10 @@
       <w:ind w:left="1320"/>
     </w:pPr>
   </w:style>
-  <w:style w:type="paragraph" w:styleId="196">
+  <w:style w:type="paragraph" w:styleId="881">
     <w:name w:val="toc 8"/>
-    <w:basedOn w:val="664"/>
-    <w:next w:val="664"/>
+    <w:basedOn w:val="886"/>
+    <w:next w:val="886"/>
     <w:uiPriority w:val="39"/>
     <w:unhideWhenUsed/>
     <w:pPr>
@@ -30707,10 +31192,10 @@
       <w:ind w:left="1540"/>
     </w:pPr>
   </w:style>
-  <w:style w:type="paragraph" w:styleId="197">
+  <w:style w:type="paragraph" w:styleId="882">
     <w:name w:val="toc 9"/>
-    <w:basedOn w:val="664"/>
-    <w:next w:val="664"/>
+    <w:basedOn w:val="886"/>
+    <w:next w:val="886"/>
     <w:uiPriority w:val="39"/>
     <w:unhideWhenUsed/>
     <w:pPr>
@@ -30719,9 +31204,9 @@
       <w:ind w:left="1760"/>
     </w:pPr>
   </w:style>
-  <w:style w:type="character" w:styleId="198">
+  <w:style w:type="character" w:styleId="883">
     <w:name w:val="Placeholder Text"/>
-    <w:basedOn w:val="148"/>
+    <w:basedOn w:val="836"/>
     <w:uiPriority w:val="99"/>
     <w:semiHidden/>
     <w:pPr>
@@ -30733,7 +31218,7 @@
       <w:color w:val="666666"/>
     </w:rPr>
   </w:style>
-  <w:style w:type="paragraph" w:styleId="208">
+  <w:style w:type="paragraph" w:styleId="884">
     <w:name w:val="TOC Heading"/>
     <w:uiPriority w:val="39"/>
     <w:unhideWhenUsed/>
@@ -30743,10 +31228,10 @@
       <w:ind/>
     </w:pPr>
   </w:style>
-  <w:style w:type="paragraph" w:styleId="209">
+  <w:style w:type="paragraph" w:styleId="885">
     <w:name w:val="table of figures"/>
-    <w:basedOn w:val="664"/>
-    <w:next w:val="664"/>
+    <w:basedOn w:val="886"/>
+    <w:next w:val="886"/>
     <w:uiPriority w:val="99"/>
     <w:unhideWhenUsed/>
     <w:pPr>
@@ -30755,7 +31240,7 @@
       <w:ind/>
     </w:pPr>
   </w:style>
-  <w:style w:type="paragraph" w:styleId="664" w:default="1">
+  <w:style w:type="paragraph" w:styleId="886" w:default="1">
     <w:name w:val="Normal"/>
     <w:qFormat/>
     <w:pPr>
@@ -30764,7 +31249,7 @@
       <w:ind/>
     </w:pPr>
   </w:style>
-  <w:style w:type="table" w:styleId="665" w:default="1">
+  <w:style w:type="table" w:styleId="887" w:default="1">
     <w:name w:val="Normal Table"/>
     <w:uiPriority w:val="99"/>
     <w:semiHidden/>
@@ -30957,7 +31442,7 @@
       </w:tcPr>
     </w:tblStylePr>
   </w:style>
-  <w:style w:type="numbering" w:styleId="666" w:default="1">
+  <w:style w:type="numbering" w:styleId="888" w:default="1">
     <w:name w:val="No List"/>
     <w:uiPriority w:val="99"/>
     <w:semiHidden/>
@@ -30968,9 +31453,9 @@
       <w:ind/>
     </w:pPr>
   </w:style>
-  <w:style w:type="paragraph" w:styleId="667">
+  <w:style w:type="paragraph" w:styleId="889">
     <w:name w:val="No Spacing"/>
-    <w:basedOn w:val="664"/>
+    <w:basedOn w:val="886"/>
     <w:uiPriority w:val="1"/>
     <w:qFormat/>
     <w:pPr>
@@ -30979,9 +31464,9 @@
       <w:ind/>
     </w:pPr>
   </w:style>
-  <w:style w:type="paragraph" w:styleId="668">
+  <w:style w:type="paragraph" w:styleId="890">
     <w:name w:val="List Paragraph"/>
-    <w:basedOn w:val="664"/>
+    <w:basedOn w:val="886"/>
     <w:uiPriority w:val="34"/>
     <w:qFormat/>
     <w:pPr>

</xml_diff>